<commit_message>
Add requirements.txt, ignore venv, add build_slice script, update code notes
</commit_message>
<xml_diff>
--- a/Code notes.docx
+++ b/Code notes.docx
@@ -9,6 +9,29 @@
           <w:szCs w:val="28"/>
         </w:rPr>
       </w:pPr>
+    </w:p>
+    <w:p>
+      <w:pPr>
+        <w:rPr>
+          <w:sz w:val="28"/>
+          <w:szCs w:val="28"/>
+        </w:rPr>
+      </w:pPr>
+      <w:r>
+        <w:rPr>
+          <w:sz w:val="28"/>
+          <w:szCs w:val="28"/>
+        </w:rPr>
+        <w:t># %%</w:t>
+      </w:r>
+    </w:p>
+    <w:p>
+      <w:pPr>
+        <w:rPr>
+          <w:sz w:val="28"/>
+          <w:szCs w:val="28"/>
+        </w:rPr>
+      </w:pPr>
       <w:r>
         <w:rPr>
           <w:sz w:val="28"/>
@@ -28,12 +51,16 @@
     <w:p>
       <w:pPr>
         <w:rPr>
-          <w:sz w:val="28"/>
-          <w:szCs w:val="28"/>
-        </w:rPr>
-      </w:pPr>
-      <w:r>
-        <w:rPr>
+          <w:b/>
+          <w:bCs/>
+          <w:sz w:val="28"/>
+          <w:szCs w:val="28"/>
+        </w:rPr>
+      </w:pPr>
+      <w:r>
+        <w:rPr>
+          <w:b/>
+          <w:bCs/>
           <w:sz w:val="28"/>
           <w:szCs w:val="28"/>
         </w:rPr>
@@ -55,20 +82,29 @@
         <w:t xml:space="preserve">df = </w:t>
       </w:r>
       <w:proofErr w:type="spellStart"/>
-      <w:r>
-        <w:rPr>
-          <w:sz w:val="28"/>
-          <w:szCs w:val="28"/>
-        </w:rPr>
-        <w:t>pd.read_csv</w:t>
-      </w:r>
-      <w:proofErr w:type="spellEnd"/>
-      <w:r>
-        <w:rPr>
-          <w:sz w:val="28"/>
-          <w:szCs w:val="28"/>
-        </w:rPr>
-        <w:t xml:space="preserve">("southwark_lambeth.csv", encoding="cp1252", </w:t>
+      <w:proofErr w:type="gramStart"/>
+      <w:r>
+        <w:rPr>
+          <w:sz w:val="28"/>
+          <w:szCs w:val="28"/>
+        </w:rPr>
+        <w:t>pd.read</w:t>
+      </w:r>
+      <w:proofErr w:type="gramEnd"/>
+      <w:r>
+        <w:rPr>
+          <w:sz w:val="28"/>
+          <w:szCs w:val="28"/>
+        </w:rPr>
+        <w:t>_csv</w:t>
+      </w:r>
+      <w:proofErr w:type="spellEnd"/>
+      <w:r>
+        <w:rPr>
+          <w:sz w:val="28"/>
+          <w:szCs w:val="28"/>
+        </w:rPr>
+        <w:t xml:space="preserve">("data/raw/GIAS.csv", encoding="cp1252", </w:t>
       </w:r>
       <w:proofErr w:type="spellStart"/>
       <w:r>
@@ -98,16 +134,20 @@
     <w:p>
       <w:pPr>
         <w:rPr>
-          <w:sz w:val="28"/>
-          <w:szCs w:val="28"/>
-        </w:rPr>
-      </w:pPr>
-      <w:r>
-        <w:rPr>
-          <w:sz w:val="28"/>
-          <w:szCs w:val="28"/>
-        </w:rPr>
-        <w:t># Keep only OPEN establishments in our two boroughs.</w:t>
+          <w:b/>
+          <w:bCs/>
+          <w:sz w:val="28"/>
+          <w:szCs w:val="28"/>
+        </w:rPr>
+      </w:pPr>
+      <w:r>
+        <w:rPr>
+          <w:b/>
+          <w:bCs/>
+          <w:sz w:val="28"/>
+          <w:szCs w:val="28"/>
+        </w:rPr>
+        <w:t># The filtering block - keep only OPEN establishments in our two boroughs.</w:t>
       </w:r>
     </w:p>
     <w:p>
@@ -138,30 +178,55 @@
           <w:sz w:val="28"/>
           <w:szCs w:val="28"/>
         </w:rPr>
-        <w:t>sl</w:t>
-      </w:r>
-      <w:proofErr w:type="spellEnd"/>
-      <w:r>
-        <w:rPr>
-          <w:sz w:val="28"/>
-          <w:szCs w:val="28"/>
-        </w:rPr>
-        <w:t xml:space="preserve"> = df[</w:t>
-      </w:r>
-    </w:p>
-    <w:p>
-      <w:pPr>
-        <w:rPr>
-          <w:sz w:val="28"/>
-          <w:szCs w:val="28"/>
-        </w:rPr>
-      </w:pPr>
-      <w:r>
-        <w:rPr>
-          <w:sz w:val="28"/>
-          <w:szCs w:val="28"/>
-        </w:rPr>
-        <w:t xml:space="preserve">    df["LA (name)"].</w:t>
+        <w:t>sl_schools</w:t>
+      </w:r>
+      <w:proofErr w:type="spellEnd"/>
+      <w:r>
+        <w:rPr>
+          <w:sz w:val="28"/>
+          <w:szCs w:val="28"/>
+        </w:rPr>
+        <w:t xml:space="preserve"> = </w:t>
+      </w:r>
+      <w:proofErr w:type="gramStart"/>
+      <w:r>
+        <w:rPr>
+          <w:sz w:val="28"/>
+          <w:szCs w:val="28"/>
+        </w:rPr>
+        <w:t>df[</w:t>
+      </w:r>
+      <w:proofErr w:type="gramEnd"/>
+    </w:p>
+    <w:p>
+      <w:pPr>
+        <w:rPr>
+          <w:sz w:val="28"/>
+          <w:szCs w:val="28"/>
+        </w:rPr>
+      </w:pPr>
+      <w:r>
+        <w:rPr>
+          <w:sz w:val="28"/>
+          <w:szCs w:val="28"/>
+        </w:rPr>
+        <w:t xml:space="preserve">    </w:t>
+      </w:r>
+      <w:proofErr w:type="gramStart"/>
+      <w:r>
+        <w:rPr>
+          <w:sz w:val="28"/>
+          <w:szCs w:val="28"/>
+        </w:rPr>
+        <w:t>df[</w:t>
+      </w:r>
+      <w:proofErr w:type="gramEnd"/>
+      <w:r>
+        <w:rPr>
+          <w:sz w:val="28"/>
+          <w:szCs w:val="28"/>
+        </w:rPr>
+        <w:t>"LA (name)"].</w:t>
       </w:r>
       <w:proofErr w:type="spellStart"/>
       <w:r>
@@ -192,7 +257,23 @@
           <w:sz w:val="28"/>
           <w:szCs w:val="28"/>
         </w:rPr>
-        <w:t xml:space="preserve">    &amp; (df["</w:t>
+        <w:t xml:space="preserve">    &amp; (</w:t>
+      </w:r>
+      <w:proofErr w:type="gramStart"/>
+      <w:r>
+        <w:rPr>
+          <w:sz w:val="28"/>
+          <w:szCs w:val="28"/>
+        </w:rPr>
+        <w:t>df[</w:t>
+      </w:r>
+      <w:proofErr w:type="gramEnd"/>
+      <w:r>
+        <w:rPr>
+          <w:sz w:val="28"/>
+          <w:szCs w:val="28"/>
+        </w:rPr>
+        <w:t>"</w:t>
       </w:r>
       <w:proofErr w:type="spellStart"/>
       <w:r>
@@ -218,51 +299,217 @@
           <w:szCs w:val="28"/>
         </w:rPr>
       </w:pPr>
-      <w:r>
-        <w:rPr>
-          <w:sz w:val="28"/>
-          <w:szCs w:val="28"/>
-        </w:rPr>
-        <w:t>].copy()</w:t>
-      </w:r>
-    </w:p>
-    <w:p>
-      <w:pPr>
-        <w:rPr>
-          <w:sz w:val="28"/>
-          <w:szCs w:val="28"/>
-        </w:rPr>
-      </w:pPr>
-    </w:p>
-    <w:p>
-      <w:pPr>
-        <w:rPr>
-          <w:sz w:val="28"/>
-          <w:szCs w:val="28"/>
-        </w:rPr>
-      </w:pPr>
-      <w:r>
-        <w:rPr>
-          <w:sz w:val="28"/>
-          <w:szCs w:val="28"/>
-        </w:rPr>
-        <w:t># Flag early-years provision: has nursery classes, OR takes children aged 3 or under.</w:t>
-      </w:r>
-    </w:p>
-    <w:p>
-      <w:pPr>
-        <w:rPr>
-          <w:sz w:val="28"/>
-          <w:szCs w:val="28"/>
-        </w:rPr>
-      </w:pPr>
-      <w:proofErr w:type="spellStart"/>
-      <w:r>
-        <w:rPr>
-          <w:sz w:val="28"/>
-          <w:szCs w:val="28"/>
-        </w:rPr>
-        <w:t>sl</w:t>
+      <w:proofErr w:type="gramStart"/>
+      <w:r>
+        <w:rPr>
+          <w:sz w:val="28"/>
+          <w:szCs w:val="28"/>
+        </w:rPr>
+        <w:t>].copy</w:t>
+      </w:r>
+      <w:proofErr w:type="gramEnd"/>
+      <w:r>
+        <w:rPr>
+          <w:sz w:val="28"/>
+          <w:szCs w:val="28"/>
+        </w:rPr>
+        <w:t>()</w:t>
+      </w:r>
+    </w:p>
+    <w:p>
+      <w:pPr>
+        <w:rPr>
+          <w:sz w:val="28"/>
+          <w:szCs w:val="28"/>
+        </w:rPr>
+      </w:pPr>
+    </w:p>
+    <w:p>
+      <w:pPr>
+        <w:rPr>
+          <w:b/>
+          <w:bCs/>
+          <w:sz w:val="28"/>
+          <w:szCs w:val="28"/>
+        </w:rPr>
+      </w:pPr>
+      <w:r>
+        <w:rPr>
+          <w:b/>
+          <w:bCs/>
+          <w:sz w:val="28"/>
+          <w:szCs w:val="28"/>
+        </w:rPr>
+        <w:t># Exclude provision not relevant (post-16 and adult education).</w:t>
+      </w:r>
+    </w:p>
+    <w:p>
+      <w:pPr>
+        <w:rPr>
+          <w:sz w:val="28"/>
+          <w:szCs w:val="28"/>
+        </w:rPr>
+      </w:pPr>
+      <w:r>
+        <w:rPr>
+          <w:sz w:val="28"/>
+          <w:szCs w:val="28"/>
+        </w:rPr>
+        <w:t>exclude = [</w:t>
+      </w:r>
+    </w:p>
+    <w:p>
+      <w:pPr>
+        <w:rPr>
+          <w:sz w:val="28"/>
+          <w:szCs w:val="28"/>
+        </w:rPr>
+      </w:pPr>
+      <w:r>
+        <w:rPr>
+          <w:sz w:val="28"/>
+          <w:szCs w:val="28"/>
+        </w:rPr>
+        <w:t xml:space="preserve">    "Higher education institutions",</w:t>
+      </w:r>
+    </w:p>
+    <w:p>
+      <w:pPr>
+        <w:rPr>
+          <w:sz w:val="28"/>
+          <w:szCs w:val="28"/>
+        </w:rPr>
+      </w:pPr>
+      <w:r>
+        <w:rPr>
+          <w:sz w:val="28"/>
+          <w:szCs w:val="28"/>
+        </w:rPr>
+        <w:t xml:space="preserve">    "Further education",</w:t>
+      </w:r>
+    </w:p>
+    <w:p>
+      <w:pPr>
+        <w:rPr>
+          <w:sz w:val="28"/>
+          <w:szCs w:val="28"/>
+        </w:rPr>
+      </w:pPr>
+      <w:r>
+        <w:rPr>
+          <w:sz w:val="28"/>
+          <w:szCs w:val="28"/>
+        </w:rPr>
+        <w:t xml:space="preserve">    "Special post 16 institution",</w:t>
+      </w:r>
+    </w:p>
+    <w:p>
+      <w:pPr>
+        <w:rPr>
+          <w:sz w:val="28"/>
+          <w:szCs w:val="28"/>
+        </w:rPr>
+      </w:pPr>
+      <w:r>
+        <w:rPr>
+          <w:sz w:val="28"/>
+          <w:szCs w:val="28"/>
+        </w:rPr>
+        <w:t xml:space="preserve">    "Free schools 16 to 19",</w:t>
+      </w:r>
+    </w:p>
+    <w:p>
+      <w:pPr>
+        <w:rPr>
+          <w:sz w:val="28"/>
+          <w:szCs w:val="28"/>
+        </w:rPr>
+      </w:pPr>
+      <w:r>
+        <w:rPr>
+          <w:sz w:val="28"/>
+          <w:szCs w:val="28"/>
+        </w:rPr>
+        <w:t xml:space="preserve">    "Academy 16 to 19 sponsor led",</w:t>
+      </w:r>
+    </w:p>
+    <w:p>
+      <w:pPr>
+        <w:rPr>
+          <w:sz w:val="28"/>
+          <w:szCs w:val="28"/>
+        </w:rPr>
+      </w:pPr>
+      <w:r>
+        <w:rPr>
+          <w:sz w:val="28"/>
+          <w:szCs w:val="28"/>
+        </w:rPr>
+        <w:t>]</w:t>
+      </w:r>
+    </w:p>
+    <w:p>
+      <w:pPr>
+        <w:rPr>
+          <w:sz w:val="28"/>
+          <w:szCs w:val="28"/>
+        </w:rPr>
+      </w:pPr>
+      <w:proofErr w:type="spellStart"/>
+      <w:r>
+        <w:rPr>
+          <w:sz w:val="28"/>
+          <w:szCs w:val="28"/>
+        </w:rPr>
+        <w:t>sl_schools</w:t>
+      </w:r>
+      <w:proofErr w:type="spellEnd"/>
+      <w:r>
+        <w:rPr>
+          <w:sz w:val="28"/>
+          <w:szCs w:val="28"/>
+        </w:rPr>
+        <w:t xml:space="preserve"> = </w:t>
+      </w:r>
+      <w:proofErr w:type="spellStart"/>
+      <w:r>
+        <w:rPr>
+          <w:sz w:val="28"/>
+          <w:szCs w:val="28"/>
+        </w:rPr>
+        <w:t>sl_</w:t>
+      </w:r>
+      <w:proofErr w:type="gramStart"/>
+      <w:r>
+        <w:rPr>
+          <w:sz w:val="28"/>
+          <w:szCs w:val="28"/>
+        </w:rPr>
+        <w:t>schools</w:t>
+      </w:r>
+      <w:proofErr w:type="spellEnd"/>
+      <w:r>
+        <w:rPr>
+          <w:sz w:val="28"/>
+          <w:szCs w:val="28"/>
+        </w:rPr>
+        <w:t>[</w:t>
+      </w:r>
+      <w:proofErr w:type="gramEnd"/>
+      <w:r>
+        <w:rPr>
+          <w:sz w:val="28"/>
+          <w:szCs w:val="28"/>
+        </w:rPr>
+        <w:t>~</w:t>
+      </w:r>
+      <w:proofErr w:type="spellStart"/>
+      <w:r>
+        <w:rPr>
+          <w:sz w:val="28"/>
+          <w:szCs w:val="28"/>
+        </w:rPr>
+        <w:t>sl_schools</w:t>
       </w:r>
       <w:proofErr w:type="spellEnd"/>
       <w:r>
@@ -278,6 +525,109 @@
           <w:sz w:val="28"/>
           <w:szCs w:val="28"/>
         </w:rPr>
+        <w:t>TypeOfEstablishment</w:t>
+      </w:r>
+      <w:proofErr w:type="spellEnd"/>
+      <w:r>
+        <w:rPr>
+          <w:sz w:val="28"/>
+          <w:szCs w:val="28"/>
+        </w:rPr>
+        <w:t xml:space="preserve"> (name)"].</w:t>
+      </w:r>
+      <w:proofErr w:type="spellStart"/>
+      <w:r>
+        <w:rPr>
+          <w:sz w:val="28"/>
+          <w:szCs w:val="28"/>
+        </w:rPr>
+        <w:t>isin</w:t>
+      </w:r>
+      <w:proofErr w:type="spellEnd"/>
+      <w:r>
+        <w:rPr>
+          <w:sz w:val="28"/>
+          <w:szCs w:val="28"/>
+        </w:rPr>
+        <w:t>(exclude)].copy()</w:t>
+      </w:r>
+    </w:p>
+    <w:p>
+      <w:pPr>
+        <w:rPr>
+          <w:sz w:val="28"/>
+          <w:szCs w:val="28"/>
+        </w:rPr>
+      </w:pPr>
+    </w:p>
+    <w:p>
+      <w:pPr>
+        <w:rPr>
+          <w:b/>
+          <w:bCs/>
+          <w:sz w:val="28"/>
+          <w:szCs w:val="28"/>
+        </w:rPr>
+      </w:pPr>
+      <w:r>
+        <w:rPr>
+          <w:b/>
+          <w:bCs/>
+          <w:sz w:val="28"/>
+          <w:szCs w:val="28"/>
+        </w:rPr>
+        <w:t xml:space="preserve"># Convert age to numbers; anything unconvertible becomes </w:t>
+      </w:r>
+      <w:proofErr w:type="spellStart"/>
+      <w:r>
+        <w:rPr>
+          <w:b/>
+          <w:bCs/>
+          <w:sz w:val="28"/>
+          <w:szCs w:val="28"/>
+        </w:rPr>
+        <w:t>NaN</w:t>
+      </w:r>
+      <w:proofErr w:type="spellEnd"/>
+      <w:r>
+        <w:rPr>
+          <w:b/>
+          <w:bCs/>
+          <w:sz w:val="28"/>
+          <w:szCs w:val="28"/>
+        </w:rPr>
+        <w:t xml:space="preserve"> instead of raising an error.</w:t>
+      </w:r>
+    </w:p>
+    <w:p>
+      <w:pPr>
+        <w:rPr>
+          <w:sz w:val="28"/>
+          <w:szCs w:val="28"/>
+        </w:rPr>
+      </w:pPr>
+      <w:proofErr w:type="spellStart"/>
+      <w:r>
+        <w:rPr>
+          <w:sz w:val="28"/>
+          <w:szCs w:val="28"/>
+        </w:rPr>
+        <w:t>sl_schools</w:t>
+      </w:r>
+      <w:proofErr w:type="spellEnd"/>
+      <w:r>
+        <w:rPr>
+          <w:sz w:val="28"/>
+          <w:szCs w:val="28"/>
+        </w:rPr>
+        <w:t>["</w:t>
+      </w:r>
+      <w:proofErr w:type="spellStart"/>
+      <w:r>
+        <w:rPr>
+          <w:sz w:val="28"/>
+          <w:szCs w:val="28"/>
+        </w:rPr>
         <w:t>StatutoryLowAge</w:t>
       </w:r>
       <w:proofErr w:type="spellEnd"/>
@@ -310,7 +660,7 @@
           <w:sz w:val="28"/>
           <w:szCs w:val="28"/>
         </w:rPr>
-        <w:t>sl</w:t>
+        <w:t>sl_schools</w:t>
       </w:r>
       <w:proofErr w:type="spellEnd"/>
       <w:r>
@@ -344,13 +694,60 @@
           <w:szCs w:val="28"/>
         </w:rPr>
       </w:pPr>
-      <w:proofErr w:type="spellStart"/>
-      <w:r>
-        <w:rPr>
-          <w:sz w:val="28"/>
-          <w:szCs w:val="28"/>
-        </w:rPr>
-        <w:t>sl</w:t>
+    </w:p>
+    <w:p>
+      <w:pPr>
+        <w:rPr>
+          <w:b/>
+          <w:bCs/>
+          <w:sz w:val="28"/>
+          <w:szCs w:val="28"/>
+        </w:rPr>
+      </w:pPr>
+      <w:r>
+        <w:rPr>
+          <w:b/>
+          <w:bCs/>
+          <w:sz w:val="28"/>
+          <w:szCs w:val="28"/>
+        </w:rPr>
+        <w:t xml:space="preserve"># Pre-reception </w:t>
+      </w:r>
+      <w:proofErr w:type="gramStart"/>
+      <w:r>
+        <w:rPr>
+          <w:b/>
+          <w:bCs/>
+          <w:sz w:val="28"/>
+          <w:szCs w:val="28"/>
+        </w:rPr>
+        <w:t>provision:</w:t>
+      </w:r>
+      <w:proofErr w:type="gramEnd"/>
+      <w:r>
+        <w:rPr>
+          <w:b/>
+          <w:bCs/>
+          <w:sz w:val="28"/>
+          <w:szCs w:val="28"/>
+        </w:rPr>
+        <w:t xml:space="preserve"> has nursery classes, OR admits children aged 3 or under.</w:t>
+      </w:r>
+    </w:p>
+    <w:p>
+      <w:pPr>
+        <w:rPr>
+          <w:sz w:val="28"/>
+          <w:szCs w:val="28"/>
+        </w:rPr>
+      </w:pPr>
+      <w:proofErr w:type="spellStart"/>
+      <w:r>
+        <w:rPr>
+          <w:sz w:val="28"/>
+          <w:szCs w:val="28"/>
+        </w:rPr>
+        <w:t>sl_schools</w:t>
       </w:r>
       <w:proofErr w:type="spellEnd"/>
       <w:r>
@@ -366,7 +763,7 @@
           <w:sz w:val="28"/>
           <w:szCs w:val="28"/>
         </w:rPr>
-        <w:t>is_early_years</w:t>
+        <w:t>has_pre_reception_provision</w:t>
       </w:r>
       <w:proofErr w:type="spellEnd"/>
       <w:r>
@@ -397,7 +794,70 @@
           <w:sz w:val="28"/>
           <w:szCs w:val="28"/>
         </w:rPr>
-        <w:t>sl</w:t>
+        <w:t>sl_</w:t>
+      </w:r>
+      <w:proofErr w:type="gramStart"/>
+      <w:r>
+        <w:rPr>
+          <w:sz w:val="28"/>
+          <w:szCs w:val="28"/>
+        </w:rPr>
+        <w:t>schools</w:t>
+      </w:r>
+      <w:proofErr w:type="spellEnd"/>
+      <w:r>
+        <w:rPr>
+          <w:sz w:val="28"/>
+          <w:szCs w:val="28"/>
+        </w:rPr>
+        <w:t>[</w:t>
+      </w:r>
+      <w:proofErr w:type="gramEnd"/>
+      <w:r>
+        <w:rPr>
+          <w:sz w:val="28"/>
+          <w:szCs w:val="28"/>
+        </w:rPr>
+        <w:t>"</w:t>
+      </w:r>
+      <w:proofErr w:type="spellStart"/>
+      <w:r>
+        <w:rPr>
+          <w:sz w:val="28"/>
+          <w:szCs w:val="28"/>
+        </w:rPr>
+        <w:t>NurseryProvision</w:t>
+      </w:r>
+      <w:proofErr w:type="spellEnd"/>
+      <w:r>
+        <w:rPr>
+          <w:sz w:val="28"/>
+          <w:szCs w:val="28"/>
+        </w:rPr>
+        <w:t xml:space="preserve"> (name)"] == "Has Nursery Classes")</w:t>
+      </w:r>
+    </w:p>
+    <w:p>
+      <w:pPr>
+        <w:rPr>
+          <w:sz w:val="28"/>
+          <w:szCs w:val="28"/>
+        </w:rPr>
+      </w:pPr>
+      <w:r>
+        <w:rPr>
+          <w:sz w:val="28"/>
+          <w:szCs w:val="28"/>
+        </w:rPr>
+        <w:t xml:space="preserve">    | (</w:t>
+      </w:r>
+      <w:proofErr w:type="spellStart"/>
+      <w:r>
+        <w:rPr>
+          <w:sz w:val="28"/>
+          <w:szCs w:val="28"/>
+        </w:rPr>
+        <w:t>sl_schools</w:t>
       </w:r>
       <w:proofErr w:type="spellEnd"/>
       <w:r>
@@ -413,38 +873,77 @@
           <w:sz w:val="28"/>
           <w:szCs w:val="28"/>
         </w:rPr>
-        <w:t>NurseryProvision</w:t>
-      </w:r>
-      <w:proofErr w:type="spellEnd"/>
-      <w:r>
-        <w:rPr>
-          <w:sz w:val="28"/>
-          <w:szCs w:val="28"/>
-        </w:rPr>
-        <w:t xml:space="preserve"> (name)"] == "Has Nursery Classes")</w:t>
-      </w:r>
-    </w:p>
-    <w:p>
-      <w:pPr>
-        <w:rPr>
-          <w:sz w:val="28"/>
-          <w:szCs w:val="28"/>
-        </w:rPr>
-      </w:pPr>
-      <w:r>
-        <w:rPr>
-          <w:sz w:val="28"/>
-          <w:szCs w:val="28"/>
-        </w:rPr>
-        <w:t xml:space="preserve">    | (</w:t>
-      </w:r>
-      <w:proofErr w:type="spellStart"/>
-      <w:r>
-        <w:rPr>
-          <w:sz w:val="28"/>
-          <w:szCs w:val="28"/>
-        </w:rPr>
-        <w:t>sl</w:t>
+        <w:t>StatutoryLowAge</w:t>
+      </w:r>
+      <w:proofErr w:type="spellEnd"/>
+      <w:r>
+        <w:rPr>
+          <w:sz w:val="28"/>
+          <w:szCs w:val="28"/>
+        </w:rPr>
+        <w:t>"] &lt;= 3)</w:t>
+      </w:r>
+    </w:p>
+    <w:p>
+      <w:pPr>
+        <w:rPr>
+          <w:sz w:val="28"/>
+          <w:szCs w:val="28"/>
+        </w:rPr>
+      </w:pPr>
+      <w:r>
+        <w:rPr>
+          <w:sz w:val="28"/>
+          <w:szCs w:val="28"/>
+        </w:rPr>
+        <w:t>)</w:t>
+      </w:r>
+    </w:p>
+    <w:p>
+      <w:pPr>
+        <w:rPr>
+          <w:sz w:val="28"/>
+          <w:szCs w:val="28"/>
+        </w:rPr>
+      </w:pPr>
+    </w:p>
+    <w:p>
+      <w:pPr>
+        <w:rPr>
+          <w:sz w:val="28"/>
+          <w:szCs w:val="28"/>
+        </w:rPr>
+      </w:pPr>
+      <w:r>
+        <w:rPr>
+          <w:sz w:val="28"/>
+          <w:szCs w:val="28"/>
+        </w:rPr>
+        <w:t xml:space="preserve">early = </w:t>
+      </w:r>
+      <w:proofErr w:type="spellStart"/>
+      <w:r>
+        <w:rPr>
+          <w:sz w:val="28"/>
+          <w:szCs w:val="28"/>
+        </w:rPr>
+        <w:t>sl_schools</w:t>
+      </w:r>
+      <w:proofErr w:type="spellEnd"/>
+      <w:r>
+        <w:rPr>
+          <w:sz w:val="28"/>
+          <w:szCs w:val="28"/>
+        </w:rPr>
+        <w:t>[</w:t>
+      </w:r>
+      <w:proofErr w:type="spellStart"/>
+      <w:r>
+        <w:rPr>
+          <w:sz w:val="28"/>
+          <w:szCs w:val="28"/>
+        </w:rPr>
+        <w:t>sl_schools</w:t>
       </w:r>
       <w:proofErr w:type="spellEnd"/>
       <w:r>
@@ -460,15 +959,358 @@
           <w:sz w:val="28"/>
           <w:szCs w:val="28"/>
         </w:rPr>
-        <w:t>StatutoryLowAge</w:t>
-      </w:r>
-      <w:proofErr w:type="spellEnd"/>
-      <w:r>
-        <w:rPr>
-          <w:sz w:val="28"/>
-          <w:szCs w:val="28"/>
-        </w:rPr>
-        <w:t>"] &lt;= 3)</w:t>
+        <w:t>has_pre_reception_provision</w:t>
+      </w:r>
+      <w:proofErr w:type="spellEnd"/>
+      <w:r>
+        <w:rPr>
+          <w:sz w:val="28"/>
+          <w:szCs w:val="28"/>
+        </w:rPr>
+        <w:t>"]</w:t>
+      </w:r>
+      <w:proofErr w:type="gramStart"/>
+      <w:r>
+        <w:rPr>
+          <w:sz w:val="28"/>
+          <w:szCs w:val="28"/>
+        </w:rPr>
+        <w:t>].copy</w:t>
+      </w:r>
+      <w:proofErr w:type="gramEnd"/>
+      <w:r>
+        <w:rPr>
+          <w:sz w:val="28"/>
+          <w:szCs w:val="28"/>
+        </w:rPr>
+        <w:t>()</w:t>
+      </w:r>
+    </w:p>
+    <w:p>
+      <w:pPr>
+        <w:rPr>
+          <w:sz w:val="28"/>
+          <w:szCs w:val="28"/>
+        </w:rPr>
+      </w:pPr>
+    </w:p>
+    <w:p>
+      <w:pPr>
+        <w:rPr>
+          <w:sz w:val="28"/>
+          <w:szCs w:val="28"/>
+        </w:rPr>
+      </w:pPr>
+      <w:r>
+        <w:rPr>
+          <w:sz w:val="28"/>
+          <w:szCs w:val="28"/>
+        </w:rPr>
+        <w:t>print(</w:t>
+      </w:r>
+      <w:proofErr w:type="spellStart"/>
+      <w:r>
+        <w:rPr>
+          <w:sz w:val="28"/>
+          <w:szCs w:val="28"/>
+        </w:rPr>
+        <w:t>len</w:t>
+      </w:r>
+      <w:proofErr w:type="spellEnd"/>
+      <w:r>
+        <w:rPr>
+          <w:sz w:val="28"/>
+          <w:szCs w:val="28"/>
+        </w:rPr>
+        <w:t>(</w:t>
+      </w:r>
+      <w:proofErr w:type="spellStart"/>
+      <w:r>
+        <w:rPr>
+          <w:sz w:val="28"/>
+          <w:szCs w:val="28"/>
+        </w:rPr>
+        <w:t>sl_schools</w:t>
+      </w:r>
+      <w:proofErr w:type="spellEnd"/>
+      <w:r>
+        <w:rPr>
+          <w:sz w:val="28"/>
+          <w:szCs w:val="28"/>
+        </w:rPr>
+        <w:t xml:space="preserve">), "open schools;", </w:t>
+      </w:r>
+      <w:proofErr w:type="spellStart"/>
+      <w:r>
+        <w:rPr>
+          <w:sz w:val="28"/>
+          <w:szCs w:val="28"/>
+        </w:rPr>
+        <w:t>len</w:t>
+      </w:r>
+      <w:proofErr w:type="spellEnd"/>
+      <w:r>
+        <w:rPr>
+          <w:sz w:val="28"/>
+          <w:szCs w:val="28"/>
+        </w:rPr>
+        <w:t>(early), "with early-years provision")</w:t>
+      </w:r>
+    </w:p>
+    <w:p>
+      <w:pPr>
+        <w:rPr>
+          <w:sz w:val="28"/>
+          <w:szCs w:val="28"/>
+        </w:rPr>
+      </w:pPr>
+    </w:p>
+    <w:p>
+      <w:pPr>
+        <w:rPr>
+          <w:b/>
+          <w:bCs/>
+          <w:sz w:val="28"/>
+          <w:szCs w:val="28"/>
+        </w:rPr>
+      </w:pPr>
+      <w:r>
+        <w:rPr>
+          <w:b/>
+          <w:bCs/>
+          <w:sz w:val="28"/>
+          <w:szCs w:val="28"/>
+        </w:rPr>
+        <w:t># Create a .csv file</w:t>
+      </w:r>
+      <w:r>
+        <w:rPr>
+          <w:b/>
+          <w:bCs/>
+          <w:sz w:val="28"/>
+          <w:szCs w:val="28"/>
+        </w:rPr>
+        <w:t xml:space="preserve"> in the ‘processed’ folder</w:t>
+      </w:r>
+      <w:r>
+        <w:rPr>
+          <w:b/>
+          <w:bCs/>
+          <w:sz w:val="28"/>
+          <w:szCs w:val="28"/>
+        </w:rPr>
+        <w:t>.</w:t>
+      </w:r>
+    </w:p>
+    <w:p>
+      <w:pPr>
+        <w:rPr>
+          <w:sz w:val="28"/>
+          <w:szCs w:val="28"/>
+        </w:rPr>
+      </w:pPr>
+      <w:r>
+        <w:rPr>
+          <w:sz w:val="28"/>
+          <w:szCs w:val="28"/>
+        </w:rPr>
+        <w:t>sl_schools.to_</w:t>
+      </w:r>
+      <w:proofErr w:type="gramStart"/>
+      <w:r>
+        <w:rPr>
+          <w:sz w:val="28"/>
+          <w:szCs w:val="28"/>
+        </w:rPr>
+        <w:t>csv(</w:t>
+      </w:r>
+      <w:proofErr w:type="gramEnd"/>
+      <w:r>
+        <w:rPr>
+          <w:sz w:val="28"/>
+          <w:szCs w:val="28"/>
+        </w:rPr>
+        <w:t>"data/processed/southwark_lambeth_schools.csv", index=False)</w:t>
+      </w:r>
+    </w:p>
+    <w:p>
+      <w:pPr>
+        <w:rPr>
+          <w:sz w:val="28"/>
+          <w:szCs w:val="28"/>
+        </w:rPr>
+      </w:pPr>
+    </w:p>
+    <w:p>
+      <w:pPr>
+        <w:rPr>
+          <w:sz w:val="28"/>
+          <w:szCs w:val="28"/>
+        </w:rPr>
+      </w:pPr>
+      <w:r>
+        <w:rPr>
+          <w:sz w:val="28"/>
+          <w:szCs w:val="28"/>
+        </w:rPr>
+        <w:t># %%</w:t>
+      </w:r>
+    </w:p>
+    <w:p>
+      <w:pPr>
+        <w:rPr>
+          <w:sz w:val="28"/>
+          <w:szCs w:val="28"/>
+        </w:rPr>
+      </w:pPr>
+      <w:proofErr w:type="spellStart"/>
+      <w:r>
+        <w:rPr>
+          <w:sz w:val="28"/>
+          <w:szCs w:val="28"/>
+        </w:rPr>
+        <w:t>ofsted</w:t>
+      </w:r>
+      <w:proofErr w:type="spellEnd"/>
+      <w:r>
+        <w:rPr>
+          <w:sz w:val="28"/>
+          <w:szCs w:val="28"/>
+        </w:rPr>
+        <w:t xml:space="preserve"> = </w:t>
+      </w:r>
+      <w:proofErr w:type="spellStart"/>
+      <w:proofErr w:type="gramStart"/>
+      <w:r>
+        <w:rPr>
+          <w:sz w:val="28"/>
+          <w:szCs w:val="28"/>
+        </w:rPr>
+        <w:t>pd.read</w:t>
+      </w:r>
+      <w:proofErr w:type="gramEnd"/>
+      <w:r>
+        <w:rPr>
+          <w:sz w:val="28"/>
+          <w:szCs w:val="28"/>
+        </w:rPr>
+        <w:t>_excel</w:t>
+      </w:r>
+      <w:proofErr w:type="spellEnd"/>
+      <w:r>
+        <w:rPr>
+          <w:sz w:val="28"/>
+          <w:szCs w:val="28"/>
+        </w:rPr>
+        <w:t>(</w:t>
+      </w:r>
+    </w:p>
+    <w:p>
+      <w:pPr>
+        <w:rPr>
+          <w:sz w:val="28"/>
+          <w:szCs w:val="28"/>
+        </w:rPr>
+      </w:pPr>
+      <w:r>
+        <w:rPr>
+          <w:sz w:val="28"/>
+          <w:szCs w:val="28"/>
+        </w:rPr>
+        <w:t xml:space="preserve">    "data/raw/ofsted_childcare_2026-03.ods",</w:t>
+      </w:r>
+    </w:p>
+    <w:p>
+      <w:pPr>
+        <w:rPr>
+          <w:sz w:val="28"/>
+          <w:szCs w:val="28"/>
+        </w:rPr>
+      </w:pPr>
+      <w:r>
+        <w:rPr>
+          <w:sz w:val="28"/>
+          <w:szCs w:val="28"/>
+        </w:rPr>
+        <w:t xml:space="preserve">    engine="</w:t>
+      </w:r>
+      <w:proofErr w:type="spellStart"/>
+      <w:r>
+        <w:rPr>
+          <w:sz w:val="28"/>
+          <w:szCs w:val="28"/>
+        </w:rPr>
+        <w:t>odf</w:t>
+      </w:r>
+      <w:proofErr w:type="spellEnd"/>
+      <w:r>
+        <w:rPr>
+          <w:sz w:val="28"/>
+          <w:szCs w:val="28"/>
+        </w:rPr>
+        <w:t>",</w:t>
+      </w:r>
+    </w:p>
+    <w:p>
+      <w:pPr>
+        <w:rPr>
+          <w:sz w:val="28"/>
+          <w:szCs w:val="28"/>
+        </w:rPr>
+      </w:pPr>
+      <w:r>
+        <w:rPr>
+          <w:sz w:val="28"/>
+          <w:szCs w:val="28"/>
+        </w:rPr>
+        <w:t xml:space="preserve">    </w:t>
+      </w:r>
+      <w:proofErr w:type="spellStart"/>
+      <w:r>
+        <w:rPr>
+          <w:sz w:val="28"/>
+          <w:szCs w:val="28"/>
+        </w:rPr>
+        <w:t>sheet_name</w:t>
+      </w:r>
+      <w:proofErr w:type="spellEnd"/>
+      <w:r>
+        <w:rPr>
+          <w:sz w:val="28"/>
+          <w:szCs w:val="28"/>
+        </w:rPr>
+        <w:t>="D1_Childcare_providers",</w:t>
+      </w:r>
+    </w:p>
+    <w:p>
+      <w:pPr>
+        <w:rPr>
+          <w:sz w:val="28"/>
+          <w:szCs w:val="28"/>
+        </w:rPr>
+      </w:pPr>
+      <w:r>
+        <w:rPr>
+          <w:sz w:val="28"/>
+          <w:szCs w:val="28"/>
+        </w:rPr>
+        <w:t xml:space="preserve">    </w:t>
+      </w:r>
+      <w:proofErr w:type="spellStart"/>
+      <w:r>
+        <w:rPr>
+          <w:sz w:val="28"/>
+          <w:szCs w:val="28"/>
+        </w:rPr>
+        <w:t>skiprows</w:t>
+      </w:r>
+      <w:proofErr w:type="spellEnd"/>
+      <w:r>
+        <w:rPr>
+          <w:sz w:val="28"/>
+          <w:szCs w:val="28"/>
+        </w:rPr>
+        <w:t>=3,</w:t>
       </w:r>
     </w:p>
     <w:p>
@@ -493,28 +1335,138 @@
           <w:szCs w:val="28"/>
         </w:rPr>
       </w:pPr>
-    </w:p>
-    <w:p>
-      <w:pPr>
-        <w:rPr>
-          <w:sz w:val="28"/>
-          <w:szCs w:val="28"/>
-        </w:rPr>
-      </w:pPr>
-      <w:r>
-        <w:rPr>
-          <w:sz w:val="28"/>
-          <w:szCs w:val="28"/>
-        </w:rPr>
-        <w:t xml:space="preserve">early = </w:t>
-      </w:r>
-      <w:proofErr w:type="spellStart"/>
-      <w:r>
-        <w:rPr>
-          <w:sz w:val="28"/>
-          <w:szCs w:val="28"/>
-        </w:rPr>
-        <w:t>sl</w:t>
+      <w:r>
+        <w:rPr>
+          <w:sz w:val="28"/>
+          <w:szCs w:val="28"/>
+        </w:rPr>
+        <w:t>print(</w:t>
+      </w:r>
+      <w:proofErr w:type="spellStart"/>
+      <w:proofErr w:type="gramStart"/>
+      <w:r>
+        <w:rPr>
+          <w:sz w:val="28"/>
+          <w:szCs w:val="28"/>
+        </w:rPr>
+        <w:t>ofsted.shape</w:t>
+      </w:r>
+      <w:proofErr w:type="spellEnd"/>
+      <w:proofErr w:type="gramEnd"/>
+      <w:r>
+        <w:rPr>
+          <w:sz w:val="28"/>
+          <w:szCs w:val="28"/>
+        </w:rPr>
+        <w:t>)</w:t>
+      </w:r>
+    </w:p>
+    <w:p>
+      <w:pPr>
+        <w:rPr>
+          <w:sz w:val="28"/>
+          <w:szCs w:val="28"/>
+        </w:rPr>
+      </w:pPr>
+      <w:r>
+        <w:rPr>
+          <w:sz w:val="28"/>
+          <w:szCs w:val="28"/>
+        </w:rPr>
+        <w:t>print(list(</w:t>
+      </w:r>
+      <w:proofErr w:type="spellStart"/>
+      <w:proofErr w:type="gramStart"/>
+      <w:r>
+        <w:rPr>
+          <w:sz w:val="28"/>
+          <w:szCs w:val="28"/>
+        </w:rPr>
+        <w:t>ofsted.columns</w:t>
+      </w:r>
+      <w:proofErr w:type="spellEnd"/>
+      <w:proofErr w:type="gramEnd"/>
+      <w:r>
+        <w:rPr>
+          <w:sz w:val="28"/>
+          <w:szCs w:val="28"/>
+        </w:rPr>
+        <w:t>))</w:t>
+      </w:r>
+    </w:p>
+    <w:p>
+      <w:pPr>
+        <w:rPr>
+          <w:sz w:val="28"/>
+          <w:szCs w:val="28"/>
+        </w:rPr>
+      </w:pPr>
+    </w:p>
+    <w:p>
+      <w:pPr>
+        <w:rPr>
+          <w:sz w:val="28"/>
+          <w:szCs w:val="28"/>
+        </w:rPr>
+      </w:pPr>
+      <w:r>
+        <w:rPr>
+          <w:sz w:val="28"/>
+          <w:szCs w:val="28"/>
+        </w:rPr>
+        <w:t># %%</w:t>
+      </w:r>
+    </w:p>
+    <w:p>
+      <w:pPr>
+        <w:rPr>
+          <w:b/>
+          <w:bCs/>
+          <w:sz w:val="28"/>
+          <w:szCs w:val="28"/>
+        </w:rPr>
+      </w:pPr>
+      <w:r>
+        <w:rPr>
+          <w:b/>
+          <w:bCs/>
+          <w:sz w:val="28"/>
+          <w:szCs w:val="28"/>
+        </w:rPr>
+        <w:t># Ofsted slice: active Early Years Register providers in our two boroughs.</w:t>
+      </w:r>
+    </w:p>
+    <w:p>
+      <w:pPr>
+        <w:rPr>
+          <w:sz w:val="28"/>
+          <w:szCs w:val="28"/>
+        </w:rPr>
+      </w:pPr>
+      <w:proofErr w:type="spellStart"/>
+      <w:r>
+        <w:rPr>
+          <w:sz w:val="28"/>
+          <w:szCs w:val="28"/>
+        </w:rPr>
+        <w:t>sl_childcare</w:t>
+      </w:r>
+      <w:proofErr w:type="spellEnd"/>
+      <w:r>
+        <w:rPr>
+          <w:sz w:val="28"/>
+          <w:szCs w:val="28"/>
+        </w:rPr>
+        <w:t xml:space="preserve"> = </w:t>
+      </w:r>
+      <w:proofErr w:type="spellStart"/>
+      <w:proofErr w:type="gramStart"/>
+      <w:r>
+        <w:rPr>
+          <w:sz w:val="28"/>
+          <w:szCs w:val="28"/>
+        </w:rPr>
+        <w:t>ofsted</w:t>
       </w:r>
       <w:proofErr w:type="spellEnd"/>
       <w:r>
@@ -524,101 +1476,747 @@
         </w:rPr>
         <w:t>[</w:t>
       </w:r>
-      <w:proofErr w:type="spellStart"/>
-      <w:r>
-        <w:rPr>
-          <w:sz w:val="28"/>
-          <w:szCs w:val="28"/>
-        </w:rPr>
-        <w:t>sl</w:t>
-      </w:r>
-      <w:proofErr w:type="spellEnd"/>
-      <w:r>
-        <w:rPr>
-          <w:sz w:val="28"/>
-          <w:szCs w:val="28"/>
+      <w:proofErr w:type="gramEnd"/>
+    </w:p>
+    <w:p>
+      <w:pPr>
+        <w:rPr>
+          <w:sz w:val="28"/>
+          <w:szCs w:val="28"/>
+        </w:rPr>
+      </w:pPr>
+      <w:r>
+        <w:rPr>
+          <w:sz w:val="28"/>
+          <w:szCs w:val="28"/>
+        </w:rPr>
+        <w:t xml:space="preserve">    </w:t>
+      </w:r>
+      <w:proofErr w:type="spellStart"/>
+      <w:proofErr w:type="gramStart"/>
+      <w:r>
+        <w:rPr>
+          <w:sz w:val="28"/>
+          <w:szCs w:val="28"/>
+        </w:rPr>
+        <w:t>ofsted</w:t>
+      </w:r>
+      <w:proofErr w:type="spellEnd"/>
+      <w:r>
+        <w:rPr>
+          <w:sz w:val="28"/>
+          <w:szCs w:val="28"/>
+        </w:rPr>
+        <w:t>[</w:t>
+      </w:r>
+      <w:proofErr w:type="gramEnd"/>
+      <w:r>
+        <w:rPr>
+          <w:sz w:val="28"/>
+          <w:szCs w:val="28"/>
+        </w:rPr>
+        <w:t>"Local authority"].</w:t>
+      </w:r>
+      <w:proofErr w:type="spellStart"/>
+      <w:r>
+        <w:rPr>
+          <w:sz w:val="28"/>
+          <w:szCs w:val="28"/>
+        </w:rPr>
+        <w:t>isin</w:t>
+      </w:r>
+      <w:proofErr w:type="spellEnd"/>
+      <w:r>
+        <w:rPr>
+          <w:sz w:val="28"/>
+          <w:szCs w:val="28"/>
+        </w:rPr>
+        <w:t>(boroughs)</w:t>
+      </w:r>
+    </w:p>
+    <w:p>
+      <w:pPr>
+        <w:rPr>
+          <w:sz w:val="28"/>
+          <w:szCs w:val="28"/>
+        </w:rPr>
+      </w:pPr>
+      <w:r>
+        <w:rPr>
+          <w:sz w:val="28"/>
+          <w:szCs w:val="28"/>
+        </w:rPr>
+        <w:t xml:space="preserve">    &amp; (</w:t>
+      </w:r>
+      <w:proofErr w:type="spellStart"/>
+      <w:proofErr w:type="gramStart"/>
+      <w:r>
+        <w:rPr>
+          <w:sz w:val="28"/>
+          <w:szCs w:val="28"/>
+        </w:rPr>
+        <w:t>ofsted</w:t>
+      </w:r>
+      <w:proofErr w:type="spellEnd"/>
+      <w:r>
+        <w:rPr>
+          <w:sz w:val="28"/>
+          <w:szCs w:val="28"/>
+        </w:rPr>
+        <w:t>[</w:t>
+      </w:r>
+      <w:proofErr w:type="gramEnd"/>
+      <w:r>
+        <w:rPr>
+          <w:sz w:val="28"/>
+          <w:szCs w:val="28"/>
+        </w:rPr>
+        <w:t>"Provider Early Years Register flag"] == "Y")</w:t>
+      </w:r>
+    </w:p>
+    <w:p>
+      <w:pPr>
+        <w:rPr>
+          <w:sz w:val="28"/>
+          <w:szCs w:val="28"/>
+        </w:rPr>
+      </w:pPr>
+      <w:proofErr w:type="gramStart"/>
+      <w:r>
+        <w:rPr>
+          <w:sz w:val="28"/>
+          <w:szCs w:val="28"/>
+        </w:rPr>
+        <w:t>].copy</w:t>
+      </w:r>
+      <w:proofErr w:type="gramEnd"/>
+      <w:r>
+        <w:rPr>
+          <w:sz w:val="28"/>
+          <w:szCs w:val="28"/>
+        </w:rPr>
+        <w:t>()</w:t>
+      </w:r>
+    </w:p>
+    <w:p>
+      <w:pPr>
+        <w:rPr>
+          <w:sz w:val="28"/>
+          <w:szCs w:val="28"/>
+        </w:rPr>
+      </w:pPr>
+      <w:r>
+        <w:rPr>
+          <w:sz w:val="28"/>
+          <w:szCs w:val="28"/>
+        </w:rPr>
+        <w:t>print(</w:t>
+      </w:r>
+      <w:proofErr w:type="spellStart"/>
+      <w:r>
+        <w:rPr>
+          <w:sz w:val="28"/>
+          <w:szCs w:val="28"/>
+        </w:rPr>
+        <w:t>len</w:t>
+      </w:r>
+      <w:proofErr w:type="spellEnd"/>
+      <w:r>
+        <w:rPr>
+          <w:sz w:val="28"/>
+          <w:szCs w:val="28"/>
+        </w:rPr>
+        <w:t>(</w:t>
+      </w:r>
+      <w:proofErr w:type="spellStart"/>
+      <w:r>
+        <w:rPr>
+          <w:sz w:val="28"/>
+          <w:szCs w:val="28"/>
+        </w:rPr>
+        <w:t>sl_childcare</w:t>
+      </w:r>
+      <w:proofErr w:type="spellEnd"/>
+      <w:r>
+        <w:rPr>
+          <w:sz w:val="28"/>
+          <w:szCs w:val="28"/>
+        </w:rPr>
+        <w:t>), "EYR providers in Southwark &amp; Lambeth")</w:t>
+      </w:r>
+    </w:p>
+    <w:p>
+      <w:pPr>
+        <w:rPr>
+          <w:sz w:val="28"/>
+          <w:szCs w:val="28"/>
+        </w:rPr>
+      </w:pPr>
+      <w:proofErr w:type="gramStart"/>
+      <w:r>
+        <w:rPr>
+          <w:sz w:val="28"/>
+          <w:szCs w:val="28"/>
+        </w:rPr>
+        <w:t>print(</w:t>
+      </w:r>
+      <w:proofErr w:type="spellStart"/>
+      <w:proofErr w:type="gramEnd"/>
+      <w:r>
+        <w:rPr>
+          <w:sz w:val="28"/>
+          <w:szCs w:val="28"/>
+        </w:rPr>
+        <w:t>sl_childcare</w:t>
+      </w:r>
+      <w:proofErr w:type="spellEnd"/>
+      <w:r>
+        <w:rPr>
+          <w:sz w:val="28"/>
+          <w:szCs w:val="28"/>
+        </w:rPr>
+        <w:t>["Provider type"].</w:t>
+      </w:r>
+      <w:proofErr w:type="spellStart"/>
+      <w:r>
+        <w:rPr>
+          <w:sz w:val="28"/>
+          <w:szCs w:val="28"/>
+        </w:rPr>
+        <w:t>value_counts</w:t>
+      </w:r>
+      <w:proofErr w:type="spellEnd"/>
+      <w:r>
+        <w:rPr>
+          <w:sz w:val="28"/>
+          <w:szCs w:val="28"/>
+        </w:rPr>
+        <w:t>())</w:t>
+      </w:r>
+    </w:p>
+    <w:p>
+      <w:pPr>
+        <w:rPr>
+          <w:sz w:val="28"/>
+          <w:szCs w:val="28"/>
+        </w:rPr>
+      </w:pPr>
+    </w:p>
+    <w:p>
+      <w:pPr>
+        <w:rPr>
+          <w:b/>
+          <w:bCs/>
+          <w:sz w:val="28"/>
+          <w:szCs w:val="28"/>
+        </w:rPr>
+      </w:pPr>
+      <w:r>
+        <w:rPr>
+          <w:b/>
+          <w:bCs/>
+          <w:sz w:val="28"/>
+          <w:szCs w:val="28"/>
+        </w:rPr>
+        <w:t># Create a .csv file</w:t>
+      </w:r>
+      <w:r>
+        <w:rPr>
+          <w:b/>
+          <w:bCs/>
+          <w:sz w:val="28"/>
+          <w:szCs w:val="28"/>
+        </w:rPr>
+        <w:t xml:space="preserve"> in the ‘processed’ folder</w:t>
+      </w:r>
+      <w:r>
+        <w:rPr>
+          <w:b/>
+          <w:bCs/>
+          <w:sz w:val="28"/>
+          <w:szCs w:val="28"/>
+        </w:rPr>
+        <w:t>.</w:t>
+      </w:r>
+    </w:p>
+    <w:p>
+      <w:pPr>
+        <w:rPr>
+          <w:sz w:val="28"/>
+          <w:szCs w:val="28"/>
+        </w:rPr>
+      </w:pPr>
+      <w:r>
+        <w:rPr>
+          <w:sz w:val="28"/>
+          <w:szCs w:val="28"/>
+        </w:rPr>
+        <w:t>sl_childcare.to_</w:t>
+      </w:r>
+      <w:proofErr w:type="gramStart"/>
+      <w:r>
+        <w:rPr>
+          <w:sz w:val="28"/>
+          <w:szCs w:val="28"/>
+        </w:rPr>
+        <w:t>csv(</w:t>
+      </w:r>
+      <w:proofErr w:type="gramEnd"/>
+      <w:r>
+        <w:rPr>
+          <w:sz w:val="28"/>
+          <w:szCs w:val="28"/>
+        </w:rPr>
+        <w:t>“data/processed/southwark_lambeth_childcare.csv”, index=False)</w:t>
+      </w:r>
+    </w:p>
+    <w:p>
+      <w:pPr>
+        <w:rPr>
+          <w:sz w:val="28"/>
+          <w:szCs w:val="28"/>
+        </w:rPr>
+      </w:pPr>
+    </w:p>
+    <w:p>
+      <w:pPr>
+        <w:rPr>
+          <w:sz w:val="28"/>
+          <w:szCs w:val="28"/>
+        </w:rPr>
+      </w:pPr>
+    </w:p>
+    <w:p>
+      <w:pPr>
+        <w:rPr>
+          <w:sz w:val="28"/>
+          <w:szCs w:val="28"/>
+        </w:rPr>
+      </w:pPr>
+    </w:p>
+    <w:p>
+      <w:pPr>
+        <w:shd w:val="clear" w:color="auto" w:fill="011627"/>
+        <w:spacing w:line="270" w:lineRule="atLeast"/>
+        <w:rPr>
+          <w:rFonts w:ascii="Menlo" w:eastAsia="Times New Roman" w:hAnsi="Menlo" w:cs="Menlo"/>
+          <w:color w:val="D6DEEB"/>
+          <w:sz w:val="18"/>
+          <w:szCs w:val="18"/>
+          <w:lang w:eastAsia="en-GB"/>
+        </w:rPr>
+      </w:pPr>
+      <w:r>
+        <w:rPr>
+          <w:rFonts w:ascii="Menlo" w:eastAsia="Times New Roman" w:hAnsi="Menlo" w:cs="Menlo"/>
+          <w:i/>
+          <w:iCs/>
+          <w:color w:val="C792EA"/>
+          <w:sz w:val="18"/>
+          <w:szCs w:val="18"/>
+          <w:lang w:eastAsia="en-GB"/>
+        </w:rPr>
+        <w:t>for</w:t>
+      </w:r>
+      <w:r>
+        <w:rPr>
+          <w:rFonts w:ascii="Menlo" w:eastAsia="Times New Roman" w:hAnsi="Menlo" w:cs="Menlo"/>
+          <w:color w:val="D6DEEB"/>
+          <w:sz w:val="18"/>
+          <w:szCs w:val="18"/>
+          <w:lang w:eastAsia="en-GB"/>
+        </w:rPr>
+        <w:t xml:space="preserve"> col </w:t>
+      </w:r>
+      <w:r>
+        <w:rPr>
+          <w:rFonts w:ascii="Menlo" w:eastAsia="Times New Roman" w:hAnsi="Menlo" w:cs="Menlo"/>
+          <w:i/>
+          <w:iCs/>
+          <w:color w:val="C792EA"/>
+          <w:sz w:val="18"/>
+          <w:szCs w:val="18"/>
+          <w:lang w:eastAsia="en-GB"/>
+        </w:rPr>
+        <w:t>in</w:t>
+      </w:r>
+      <w:r>
+        <w:rPr>
+          <w:rFonts w:ascii="Menlo" w:eastAsia="Times New Roman" w:hAnsi="Menlo" w:cs="Menlo"/>
+          <w:color w:val="D6DEEB"/>
+          <w:sz w:val="18"/>
+          <w:szCs w:val="18"/>
+          <w:lang w:eastAsia="en-GB"/>
+        </w:rPr>
+        <w:t xml:space="preserve"> </w:t>
+      </w:r>
+      <w:r>
+        <w:rPr>
+          <w:rFonts w:ascii="Menlo" w:eastAsia="Times New Roman" w:hAnsi="Menlo" w:cs="Menlo"/>
+          <w:color w:val="D9F5DD"/>
+          <w:sz w:val="18"/>
+          <w:szCs w:val="18"/>
+          <w:lang w:eastAsia="en-GB"/>
         </w:rPr>
         <w:t>["</w:t>
       </w:r>
-      <w:proofErr w:type="spellStart"/>
-      <w:r>
-        <w:rPr>
-          <w:sz w:val="28"/>
-          <w:szCs w:val="28"/>
-        </w:rPr>
-        <w:t>is_early_years</w:t>
-      </w:r>
-      <w:proofErr w:type="spellEnd"/>
-      <w:r>
-        <w:rPr>
-          <w:sz w:val="28"/>
-          <w:szCs w:val="28"/>
-        </w:rPr>
-        <w:t>"]].copy()</w:t>
-      </w:r>
-    </w:p>
-    <w:p>
-      <w:pPr>
-        <w:rPr>
-          <w:sz w:val="28"/>
-          <w:szCs w:val="28"/>
-        </w:rPr>
-      </w:pPr>
-      <w:r>
-        <w:rPr>
-          <w:sz w:val="28"/>
-          <w:szCs w:val="28"/>
-        </w:rPr>
-        <w:t>print(</w:t>
-      </w:r>
-      <w:proofErr w:type="spellStart"/>
-      <w:r>
-        <w:rPr>
-          <w:sz w:val="28"/>
-          <w:szCs w:val="28"/>
-        </w:rPr>
-        <w:t>len</w:t>
-      </w:r>
-      <w:proofErr w:type="spellEnd"/>
-      <w:r>
-        <w:rPr>
-          <w:sz w:val="28"/>
-          <w:szCs w:val="28"/>
+      <w:r>
+        <w:rPr>
+          <w:rFonts w:ascii="Menlo" w:eastAsia="Times New Roman" w:hAnsi="Menlo" w:cs="Menlo"/>
+          <w:color w:val="ECC48D"/>
+          <w:sz w:val="18"/>
+          <w:szCs w:val="18"/>
+          <w:lang w:eastAsia="en-GB"/>
+        </w:rPr>
+        <w:t>Provider status</w:t>
+      </w:r>
+      <w:r>
+        <w:rPr>
+          <w:rFonts w:ascii="Menlo" w:eastAsia="Times New Roman" w:hAnsi="Menlo" w:cs="Menlo"/>
+          <w:color w:val="D9F5DD"/>
+          <w:sz w:val="18"/>
+          <w:szCs w:val="18"/>
+          <w:lang w:eastAsia="en-GB"/>
+        </w:rPr>
+        <w:t>"</w:t>
+      </w:r>
+      <w:r>
+        <w:rPr>
+          <w:rFonts w:ascii="Menlo" w:eastAsia="Times New Roman" w:hAnsi="Menlo" w:cs="Menlo"/>
+          <w:color w:val="D6DEEB"/>
+          <w:sz w:val="18"/>
+          <w:szCs w:val="18"/>
+          <w:lang w:eastAsia="en-GB"/>
+        </w:rPr>
+        <w:t xml:space="preserve">, </w:t>
+      </w:r>
+      <w:r>
+        <w:rPr>
+          <w:rFonts w:ascii="Menlo" w:eastAsia="Times New Roman" w:hAnsi="Menlo" w:cs="Menlo"/>
+          <w:color w:val="D9F5DD"/>
+          <w:sz w:val="18"/>
+          <w:szCs w:val="18"/>
+          <w:lang w:eastAsia="en-GB"/>
+        </w:rPr>
+        <w:t>"</w:t>
+      </w:r>
+      <w:r>
+        <w:rPr>
+          <w:rFonts w:ascii="Menlo" w:eastAsia="Times New Roman" w:hAnsi="Menlo" w:cs="Menlo"/>
+          <w:color w:val="ECC48D"/>
+          <w:sz w:val="18"/>
+          <w:szCs w:val="18"/>
+          <w:lang w:eastAsia="en-GB"/>
+        </w:rPr>
+        <w:t>Provider type</w:t>
+      </w:r>
+      <w:r>
+        <w:rPr>
+          <w:rFonts w:ascii="Menlo" w:eastAsia="Times New Roman" w:hAnsi="Menlo" w:cs="Menlo"/>
+          <w:color w:val="D9F5DD"/>
+          <w:sz w:val="18"/>
+          <w:szCs w:val="18"/>
+          <w:lang w:eastAsia="en-GB"/>
+        </w:rPr>
+        <w:t>"</w:t>
+      </w:r>
+      <w:r>
+        <w:rPr>
+          <w:rFonts w:ascii="Menlo" w:eastAsia="Times New Roman" w:hAnsi="Menlo" w:cs="Menlo"/>
+          <w:color w:val="D6DEEB"/>
+          <w:sz w:val="18"/>
+          <w:szCs w:val="18"/>
+          <w:lang w:eastAsia="en-GB"/>
+        </w:rPr>
+        <w:t xml:space="preserve">, </w:t>
+      </w:r>
+      <w:r>
+        <w:rPr>
+          <w:rFonts w:ascii="Menlo" w:eastAsia="Times New Roman" w:hAnsi="Menlo" w:cs="Menlo"/>
+          <w:color w:val="D9F5DD"/>
+          <w:sz w:val="18"/>
+          <w:szCs w:val="18"/>
+          <w:lang w:eastAsia="en-GB"/>
+        </w:rPr>
+        <w:t>"</w:t>
+      </w:r>
+      <w:r>
+        <w:rPr>
+          <w:rFonts w:ascii="Menlo" w:eastAsia="Times New Roman" w:hAnsi="Menlo" w:cs="Menlo"/>
+          <w:color w:val="ECC48D"/>
+          <w:sz w:val="18"/>
+          <w:szCs w:val="18"/>
+          <w:lang w:eastAsia="en-GB"/>
+        </w:rPr>
+        <w:t>Provider Early Years Register flag</w:t>
+      </w:r>
+      <w:r>
+        <w:rPr>
+          <w:rFonts w:ascii="Menlo" w:eastAsia="Times New Roman" w:hAnsi="Menlo" w:cs="Menlo"/>
+          <w:color w:val="D9F5DD"/>
+          <w:sz w:val="18"/>
+          <w:szCs w:val="18"/>
+          <w:lang w:eastAsia="en-GB"/>
+        </w:rPr>
+        <w:t>"</w:t>
+      </w:r>
+      <w:r>
+        <w:rPr>
+          <w:rFonts w:ascii="Menlo" w:eastAsia="Times New Roman" w:hAnsi="Menlo" w:cs="Menlo"/>
+          <w:color w:val="D6DEEB"/>
+          <w:sz w:val="18"/>
+          <w:szCs w:val="18"/>
+          <w:lang w:eastAsia="en-GB"/>
+        </w:rPr>
+        <w:t xml:space="preserve">, </w:t>
+      </w:r>
+      <w:r>
+        <w:rPr>
+          <w:rFonts w:ascii="Menlo" w:eastAsia="Times New Roman" w:hAnsi="Menlo" w:cs="Menlo"/>
+          <w:color w:val="D9F5DD"/>
+          <w:sz w:val="18"/>
+          <w:szCs w:val="18"/>
+          <w:lang w:eastAsia="en-GB"/>
+        </w:rPr>
+        <w:t>"</w:t>
+      </w:r>
+      <w:r>
+        <w:rPr>
+          <w:rFonts w:ascii="Menlo" w:eastAsia="Times New Roman" w:hAnsi="Menlo" w:cs="Menlo"/>
+          <w:color w:val="ECC48D"/>
+          <w:sz w:val="18"/>
+          <w:szCs w:val="18"/>
+          <w:lang w:eastAsia="en-GB"/>
+        </w:rPr>
+        <w:t>Local authority</w:t>
+      </w:r>
+      <w:r>
+        <w:rPr>
+          <w:rFonts w:ascii="Menlo" w:eastAsia="Times New Roman" w:hAnsi="Menlo" w:cs="Menlo"/>
+          <w:color w:val="D9F5DD"/>
+          <w:sz w:val="18"/>
+          <w:szCs w:val="18"/>
+          <w:lang w:eastAsia="en-GB"/>
+        </w:rPr>
+        <w:t>"]</w:t>
+      </w:r>
+      <w:r>
+        <w:rPr>
+          <w:rFonts w:ascii="Menlo" w:eastAsia="Times New Roman" w:hAnsi="Menlo" w:cs="Menlo"/>
+          <w:color w:val="D6DEEB"/>
+          <w:sz w:val="18"/>
+          <w:szCs w:val="18"/>
+          <w:lang w:eastAsia="en-GB"/>
+        </w:rPr>
+        <w:t>:</w:t>
+      </w:r>
+    </w:p>
+    <w:p>
+      <w:pPr>
+        <w:shd w:val="clear" w:color="auto" w:fill="011627"/>
+        <w:spacing w:line="270" w:lineRule="atLeast"/>
+        <w:rPr>
+          <w:rFonts w:ascii="Menlo" w:eastAsia="Times New Roman" w:hAnsi="Menlo" w:cs="Menlo"/>
+          <w:color w:val="D6DEEB"/>
+          <w:sz w:val="18"/>
+          <w:szCs w:val="18"/>
+          <w:lang w:eastAsia="en-GB"/>
+        </w:rPr>
+      </w:pPr>
+      <w:r>
+        <w:rPr>
+          <w:rFonts w:ascii="Menlo" w:eastAsia="Times New Roman" w:hAnsi="Menlo" w:cs="Menlo"/>
+          <w:color w:val="D6DEEB"/>
+          <w:sz w:val="18"/>
+          <w:szCs w:val="18"/>
+          <w:lang w:eastAsia="en-GB"/>
+        </w:rPr>
+        <w:t xml:space="preserve">    </w:t>
+      </w:r>
+      <w:r>
+        <w:rPr>
+          <w:rFonts w:ascii="Menlo" w:eastAsia="Times New Roman" w:hAnsi="Menlo" w:cs="Menlo"/>
+          <w:color w:val="C5E478"/>
+          <w:sz w:val="18"/>
+          <w:szCs w:val="18"/>
+          <w:lang w:eastAsia="en-GB"/>
+        </w:rPr>
+        <w:t>print</w:t>
+      </w:r>
+      <w:r>
+        <w:rPr>
+          <w:rFonts w:ascii="Menlo" w:eastAsia="Times New Roman" w:hAnsi="Menlo" w:cs="Menlo"/>
+          <w:color w:val="D6DEEB"/>
+          <w:sz w:val="18"/>
+          <w:szCs w:val="18"/>
+          <w:lang w:eastAsia="en-GB"/>
         </w:rPr>
         <w:t>(</w:t>
       </w:r>
       <w:proofErr w:type="spellStart"/>
       <w:r>
         <w:rPr>
-          <w:sz w:val="28"/>
-          <w:szCs w:val="28"/>
-        </w:rPr>
-        <w:t>sl</w:t>
-      </w:r>
-      <w:proofErr w:type="spellEnd"/>
-      <w:r>
-        <w:rPr>
-          <w:sz w:val="28"/>
-          <w:szCs w:val="28"/>
-        </w:rPr>
-        <w:t xml:space="preserve">), "open schools;", </w:t>
-      </w:r>
-      <w:proofErr w:type="spellStart"/>
-      <w:r>
-        <w:rPr>
-          <w:sz w:val="28"/>
-          <w:szCs w:val="28"/>
-        </w:rPr>
-        <w:t>len</w:t>
-      </w:r>
-      <w:proofErr w:type="spellEnd"/>
-      <w:r>
-        <w:rPr>
-          <w:sz w:val="28"/>
-          <w:szCs w:val="28"/>
-        </w:rPr>
-        <w:t>(early), "with early-years provision")</w:t>
-      </w:r>
+          <w:rFonts w:ascii="Menlo" w:eastAsia="Times New Roman" w:hAnsi="Menlo" w:cs="Menlo"/>
+          <w:color w:val="82AAFF"/>
+          <w:sz w:val="18"/>
+          <w:szCs w:val="18"/>
+          <w:lang w:eastAsia="en-GB"/>
+        </w:rPr>
+        <w:t>ofsted</w:t>
+      </w:r>
+      <w:proofErr w:type="spellEnd"/>
+      <w:r>
+        <w:rPr>
+          <w:rFonts w:ascii="Menlo" w:eastAsia="Times New Roman" w:hAnsi="Menlo" w:cs="Menlo"/>
+          <w:color w:val="D6DEEB"/>
+          <w:sz w:val="18"/>
+          <w:szCs w:val="18"/>
+          <w:lang w:eastAsia="en-GB"/>
+        </w:rPr>
+        <w:t>[</w:t>
+      </w:r>
+      <w:r>
+        <w:rPr>
+          <w:rFonts w:ascii="Menlo" w:eastAsia="Times New Roman" w:hAnsi="Menlo" w:cs="Menlo"/>
+          <w:color w:val="82AAFF"/>
+          <w:sz w:val="18"/>
+          <w:szCs w:val="18"/>
+          <w:lang w:eastAsia="en-GB"/>
+        </w:rPr>
+        <w:t>col</w:t>
+      </w:r>
+      <w:r>
+        <w:rPr>
+          <w:rFonts w:ascii="Menlo" w:eastAsia="Times New Roman" w:hAnsi="Menlo" w:cs="Menlo"/>
+          <w:color w:val="D6DEEB"/>
+          <w:sz w:val="18"/>
+          <w:szCs w:val="18"/>
+          <w:lang w:eastAsia="en-GB"/>
+        </w:rPr>
+        <w:t>]</w:t>
+      </w:r>
+      <w:r>
+        <w:rPr>
+          <w:rFonts w:ascii="Menlo" w:eastAsia="Times New Roman" w:hAnsi="Menlo" w:cs="Menlo"/>
+          <w:color w:val="82AAFF"/>
+          <w:sz w:val="18"/>
+          <w:szCs w:val="18"/>
+          <w:lang w:eastAsia="en-GB"/>
+        </w:rPr>
+        <w:t>.</w:t>
+      </w:r>
+      <w:proofErr w:type="spellStart"/>
+      <w:r>
+        <w:rPr>
+          <w:rFonts w:ascii="Menlo" w:eastAsia="Times New Roman" w:hAnsi="Menlo" w:cs="Menlo"/>
+          <w:color w:val="B2CCD6"/>
+          <w:sz w:val="18"/>
+          <w:szCs w:val="18"/>
+          <w:lang w:eastAsia="en-GB"/>
+        </w:rPr>
+        <w:t>value_</w:t>
+      </w:r>
+      <w:proofErr w:type="gramStart"/>
+      <w:r>
+        <w:rPr>
+          <w:rFonts w:ascii="Menlo" w:eastAsia="Times New Roman" w:hAnsi="Menlo" w:cs="Menlo"/>
+          <w:color w:val="B2CCD6"/>
+          <w:sz w:val="18"/>
+          <w:szCs w:val="18"/>
+          <w:lang w:eastAsia="en-GB"/>
+        </w:rPr>
+        <w:t>counts</w:t>
+      </w:r>
+      <w:proofErr w:type="spellEnd"/>
+      <w:r>
+        <w:rPr>
+          <w:rFonts w:ascii="Menlo" w:eastAsia="Times New Roman" w:hAnsi="Menlo" w:cs="Menlo"/>
+          <w:color w:val="D6DEEB"/>
+          <w:sz w:val="18"/>
+          <w:szCs w:val="18"/>
+          <w:lang w:eastAsia="en-GB"/>
+        </w:rPr>
+        <w:t>(</w:t>
+      </w:r>
+      <w:proofErr w:type="gramEnd"/>
+      <w:r>
+        <w:rPr>
+          <w:rFonts w:ascii="Menlo" w:eastAsia="Times New Roman" w:hAnsi="Menlo" w:cs="Menlo"/>
+          <w:color w:val="D6DEEB"/>
+          <w:sz w:val="18"/>
+          <w:szCs w:val="18"/>
+          <w:lang w:eastAsia="en-GB"/>
+        </w:rPr>
+        <w:t>)</w:t>
+      </w:r>
+      <w:r>
+        <w:rPr>
+          <w:rFonts w:ascii="Menlo" w:eastAsia="Times New Roman" w:hAnsi="Menlo" w:cs="Menlo"/>
+          <w:color w:val="D9F5DD"/>
+          <w:sz w:val="18"/>
+          <w:szCs w:val="18"/>
+          <w:lang w:eastAsia="en-GB"/>
+        </w:rPr>
+        <w:t>,</w:t>
+      </w:r>
+      <w:r>
+        <w:rPr>
+          <w:rFonts w:ascii="Menlo" w:eastAsia="Times New Roman" w:hAnsi="Menlo" w:cs="Menlo"/>
+          <w:color w:val="82AAFF"/>
+          <w:sz w:val="18"/>
+          <w:szCs w:val="18"/>
+          <w:lang w:eastAsia="en-GB"/>
+        </w:rPr>
+        <w:t xml:space="preserve"> </w:t>
+      </w:r>
+      <w:r>
+        <w:rPr>
+          <w:rFonts w:ascii="Menlo" w:eastAsia="Times New Roman" w:hAnsi="Menlo" w:cs="Menlo"/>
+          <w:color w:val="D9F5DD"/>
+          <w:sz w:val="18"/>
+          <w:szCs w:val="18"/>
+          <w:lang w:eastAsia="en-GB"/>
+        </w:rPr>
+        <w:t>"</w:t>
+      </w:r>
+      <w:r>
+        <w:rPr>
+          <w:rFonts w:ascii="Menlo" w:eastAsia="Times New Roman" w:hAnsi="Menlo" w:cs="Menlo"/>
+          <w:color w:val="F78C6C"/>
+          <w:sz w:val="18"/>
+          <w:szCs w:val="18"/>
+          <w:lang w:eastAsia="en-GB"/>
+        </w:rPr>
+        <w:t>\n</w:t>
+      </w:r>
+      <w:r>
+        <w:rPr>
+          <w:rFonts w:ascii="Menlo" w:eastAsia="Times New Roman" w:hAnsi="Menlo" w:cs="Menlo"/>
+          <w:color w:val="D9F5DD"/>
+          <w:sz w:val="18"/>
+          <w:szCs w:val="18"/>
+          <w:lang w:eastAsia="en-GB"/>
+        </w:rPr>
+        <w:t>"</w:t>
+      </w:r>
+      <w:r>
+        <w:rPr>
+          <w:rFonts w:ascii="Menlo" w:eastAsia="Times New Roman" w:hAnsi="Menlo" w:cs="Menlo"/>
+          <w:color w:val="D6DEEB"/>
+          <w:sz w:val="18"/>
+          <w:szCs w:val="18"/>
+          <w:lang w:eastAsia="en-GB"/>
+        </w:rPr>
+        <w:t>)</w:t>
+      </w:r>
+    </w:p>
+    <w:p>
+      <w:pPr>
+        <w:rPr>
+          <w:sz w:val="28"/>
+          <w:szCs w:val="28"/>
+        </w:rPr>
+      </w:pPr>
     </w:p>
     <w:p>
       <w:pPr>
@@ -692,7 +2290,23 @@
           <w:szCs w:val="28"/>
         </w:rPr>
         <w:br/>
-        <w:t xml:space="preserve">Loads the pandas library and gives it the short alias </w:t>
+        <w:t xml:space="preserve">Loads the </w:t>
+      </w:r>
+      <w:proofErr w:type="gramStart"/>
+      <w:r>
+        <w:rPr>
+          <w:sz w:val="28"/>
+          <w:szCs w:val="28"/>
+        </w:rPr>
+        <w:t>pandas</w:t>
+      </w:r>
+      <w:proofErr w:type="gramEnd"/>
+      <w:r>
+        <w:rPr>
+          <w:sz w:val="28"/>
+          <w:szCs w:val="28"/>
+        </w:rPr>
+        <w:t xml:space="preserve"> library and gives it the short alias </w:t>
       </w:r>
       <w:r>
         <w:rPr>
@@ -746,26 +2360,58 @@
         <w:t xml:space="preserve">df = </w:t>
       </w:r>
       <w:proofErr w:type="spellStart"/>
-      <w:r>
-        <w:rPr>
-          <w:rStyle w:val="HTMLCode"/>
-          <w:b/>
-          <w:bCs/>
-          <w:sz w:val="28"/>
-          <w:szCs w:val="28"/>
-        </w:rPr>
-        <w:t>pd.read_csv</w:t>
-      </w:r>
-      <w:proofErr w:type="spellEnd"/>
-      <w:r>
-        <w:rPr>
-          <w:rStyle w:val="HTMLCode"/>
-          <w:b/>
-          <w:bCs/>
-          <w:sz w:val="28"/>
-          <w:szCs w:val="28"/>
-        </w:rPr>
-        <w:t xml:space="preserve">("southwark_lambeth.csv", encoding="cp1252", </w:t>
+      <w:proofErr w:type="gramStart"/>
+      <w:r>
+        <w:rPr>
+          <w:rStyle w:val="HTMLCode"/>
+          <w:b/>
+          <w:bCs/>
+          <w:sz w:val="28"/>
+          <w:szCs w:val="28"/>
+        </w:rPr>
+        <w:t>pd.read</w:t>
+      </w:r>
+      <w:proofErr w:type="gramEnd"/>
+      <w:r>
+        <w:rPr>
+          <w:rStyle w:val="HTMLCode"/>
+          <w:b/>
+          <w:bCs/>
+          <w:sz w:val="28"/>
+          <w:szCs w:val="28"/>
+        </w:rPr>
+        <w:t>_csv</w:t>
+      </w:r>
+      <w:proofErr w:type="spellEnd"/>
+      <w:r>
+        <w:rPr>
+          <w:rStyle w:val="HTMLCode"/>
+          <w:b/>
+          <w:bCs/>
+          <w:sz w:val="28"/>
+          <w:szCs w:val="28"/>
+        </w:rPr>
+        <w:t>("</w:t>
+      </w:r>
+      <w:r>
+        <w:rPr>
+          <w:rStyle w:val="HTMLCode"/>
+          <w:b/>
+          <w:bCs/>
+          <w:sz w:val="28"/>
+          <w:szCs w:val="28"/>
+        </w:rPr>
+        <w:t>GIAS</w:t>
+      </w:r>
+      <w:r>
+        <w:rPr>
+          <w:rStyle w:val="HTMLCode"/>
+          <w:b/>
+          <w:bCs/>
+          <w:sz w:val="28"/>
+          <w:szCs w:val="28"/>
+        </w:rPr>
+        <w:t xml:space="preserve">.csv", encoding="cp1252", </w:t>
       </w:r>
       <w:proofErr w:type="spellStart"/>
       <w:r>
@@ -965,6 +2611,571 @@
           <w:sz w:val="28"/>
           <w:szCs w:val="28"/>
         </w:rPr>
+        <w:t>s</w:t>
+      </w:r>
+      <w:r>
+        <w:rPr>
+          <w:sz w:val="28"/>
+          <w:szCs w:val="28"/>
+        </w:rPr>
+        <w:t>l</w:t>
+      </w:r>
+      <w:r>
+        <w:rPr>
+          <w:sz w:val="28"/>
+          <w:szCs w:val="28"/>
+        </w:rPr>
+        <w:t>_schools</w:t>
+      </w:r>
+      <w:proofErr w:type="spellEnd"/>
+      <w:r>
+        <w:rPr>
+          <w:sz w:val="28"/>
+          <w:szCs w:val="28"/>
+        </w:rPr>
+        <w:t xml:space="preserve"> = </w:t>
+      </w:r>
+      <w:proofErr w:type="gramStart"/>
+      <w:r>
+        <w:rPr>
+          <w:sz w:val="28"/>
+          <w:szCs w:val="28"/>
+        </w:rPr>
+        <w:t>df[</w:t>
+      </w:r>
+      <w:proofErr w:type="gramEnd"/>
+    </w:p>
+    <w:p>
+      <w:pPr>
+        <w:pStyle w:val="font-claude-response-body"/>
+        <w:rPr>
+          <w:sz w:val="28"/>
+          <w:szCs w:val="28"/>
+        </w:rPr>
+      </w:pPr>
+      <w:r>
+        <w:rPr>
+          <w:sz w:val="28"/>
+          <w:szCs w:val="28"/>
+        </w:rPr>
+        <w:t xml:space="preserve">    </w:t>
+      </w:r>
+      <w:proofErr w:type="gramStart"/>
+      <w:r>
+        <w:rPr>
+          <w:sz w:val="28"/>
+          <w:szCs w:val="28"/>
+        </w:rPr>
+        <w:t>df[</w:t>
+      </w:r>
+      <w:proofErr w:type="gramEnd"/>
+      <w:r>
+        <w:rPr>
+          <w:sz w:val="28"/>
+          <w:szCs w:val="28"/>
+        </w:rPr>
+        <w:t>"LA (name)"].</w:t>
+      </w:r>
+      <w:proofErr w:type="spellStart"/>
+      <w:r>
+        <w:rPr>
+          <w:sz w:val="28"/>
+          <w:szCs w:val="28"/>
+        </w:rPr>
+        <w:t>isin</w:t>
+      </w:r>
+      <w:proofErr w:type="spellEnd"/>
+      <w:r>
+        <w:rPr>
+          <w:sz w:val="28"/>
+          <w:szCs w:val="28"/>
+        </w:rPr>
+        <w:t>(boroughs)</w:t>
+      </w:r>
+    </w:p>
+    <w:p>
+      <w:pPr>
+        <w:pStyle w:val="font-claude-response-body"/>
+        <w:rPr>
+          <w:sz w:val="28"/>
+          <w:szCs w:val="28"/>
+        </w:rPr>
+      </w:pPr>
+      <w:r>
+        <w:rPr>
+          <w:sz w:val="28"/>
+          <w:szCs w:val="28"/>
+        </w:rPr>
+        <w:t xml:space="preserve">    &amp; (</w:t>
+      </w:r>
+      <w:proofErr w:type="gramStart"/>
+      <w:r>
+        <w:rPr>
+          <w:sz w:val="28"/>
+          <w:szCs w:val="28"/>
+        </w:rPr>
+        <w:t>df[</w:t>
+      </w:r>
+      <w:proofErr w:type="gramEnd"/>
+      <w:r>
+        <w:rPr>
+          <w:sz w:val="28"/>
+          <w:szCs w:val="28"/>
+        </w:rPr>
+        <w:t>"</w:t>
+      </w:r>
+      <w:proofErr w:type="spellStart"/>
+      <w:r>
+        <w:rPr>
+          <w:sz w:val="28"/>
+          <w:szCs w:val="28"/>
+        </w:rPr>
+        <w:t>EstablishmentStatus</w:t>
+      </w:r>
+      <w:proofErr w:type="spellEnd"/>
+      <w:r>
+        <w:rPr>
+          <w:sz w:val="28"/>
+          <w:szCs w:val="28"/>
+        </w:rPr>
+        <w:t xml:space="preserve"> (name)"] == "Open")</w:t>
+      </w:r>
+    </w:p>
+    <w:p>
+      <w:pPr>
+        <w:pStyle w:val="font-claude-response-body"/>
+        <w:rPr>
+          <w:sz w:val="28"/>
+          <w:szCs w:val="28"/>
+        </w:rPr>
+      </w:pPr>
+      <w:proofErr w:type="gramStart"/>
+      <w:r>
+        <w:rPr>
+          <w:sz w:val="28"/>
+          <w:szCs w:val="28"/>
+        </w:rPr>
+        <w:t>].copy</w:t>
+      </w:r>
+      <w:proofErr w:type="gramEnd"/>
+      <w:r>
+        <w:rPr>
+          <w:sz w:val="28"/>
+          <w:szCs w:val="28"/>
+        </w:rPr>
+        <w:t>()</w:t>
+      </w:r>
+    </w:p>
+    <w:p>
+      <w:pPr>
+        <w:pStyle w:val="font-claude-response-body"/>
+        <w:rPr>
+          <w:sz w:val="28"/>
+          <w:szCs w:val="28"/>
+        </w:rPr>
+      </w:pPr>
+      <w:r>
+        <w:rPr>
+          <w:sz w:val="28"/>
+          <w:szCs w:val="28"/>
+        </w:rPr>
+        <w:t xml:space="preserve">Read it inside-out. </w:t>
+      </w:r>
+      <w:proofErr w:type="gramStart"/>
+      <w:r>
+        <w:rPr>
+          <w:rStyle w:val="HTMLCode"/>
+          <w:sz w:val="28"/>
+          <w:szCs w:val="28"/>
+        </w:rPr>
+        <w:t>df[</w:t>
+      </w:r>
+      <w:proofErr w:type="gramEnd"/>
+      <w:r>
+        <w:rPr>
+          <w:rStyle w:val="HTMLCode"/>
+          <w:sz w:val="28"/>
+          <w:szCs w:val="28"/>
+        </w:rPr>
+        <w:t>"LA (name)"]</w:t>
+      </w:r>
+      <w:r>
+        <w:rPr>
+          <w:sz w:val="28"/>
+          <w:szCs w:val="28"/>
+        </w:rPr>
+        <w:t xml:space="preserve"> pulls out a single column (pandas calls a single column a </w:t>
+      </w:r>
+      <w:r>
+        <w:rPr>
+          <w:rStyle w:val="Strong"/>
+          <w:sz w:val="28"/>
+          <w:szCs w:val="28"/>
+        </w:rPr>
+        <w:t>Series</w:t>
+      </w:r>
+      <w:r>
+        <w:rPr>
+          <w:sz w:val="28"/>
+          <w:szCs w:val="28"/>
+        </w:rPr>
+        <w:t xml:space="preserve">). </w:t>
+      </w:r>
+      <w:proofErr w:type="gramStart"/>
+      <w:r>
+        <w:rPr>
+          <w:rStyle w:val="HTMLCode"/>
+          <w:sz w:val="28"/>
+          <w:szCs w:val="28"/>
+        </w:rPr>
+        <w:t>.</w:t>
+      </w:r>
+      <w:proofErr w:type="spellStart"/>
+      <w:r>
+        <w:rPr>
+          <w:rStyle w:val="HTMLCode"/>
+          <w:sz w:val="28"/>
+          <w:szCs w:val="28"/>
+        </w:rPr>
+        <w:t>isin</w:t>
+      </w:r>
+      <w:proofErr w:type="spellEnd"/>
+      <w:proofErr w:type="gramEnd"/>
+      <w:r>
+        <w:rPr>
+          <w:rStyle w:val="HTMLCode"/>
+          <w:sz w:val="28"/>
+          <w:szCs w:val="28"/>
+        </w:rPr>
+        <w:t>(boroughs)</w:t>
+      </w:r>
+      <w:r>
+        <w:rPr>
+          <w:sz w:val="28"/>
+          <w:szCs w:val="28"/>
+        </w:rPr>
+        <w:t xml:space="preserve"> turns that column into a column of </w:t>
+      </w:r>
+      <w:r>
+        <w:rPr>
+          <w:rStyle w:val="Strong"/>
+          <w:sz w:val="28"/>
+          <w:szCs w:val="28"/>
+        </w:rPr>
+        <w:t>True/False</w:t>
+      </w:r>
+      <w:r>
+        <w:rPr>
+          <w:sz w:val="28"/>
+          <w:szCs w:val="28"/>
+        </w:rPr>
+        <w:t xml:space="preserve"> — True on rows whose LA name is in our list. Separately, </w:t>
+      </w:r>
+      <w:proofErr w:type="gramStart"/>
+      <w:r>
+        <w:rPr>
+          <w:rStyle w:val="HTMLCode"/>
+          <w:sz w:val="28"/>
+          <w:szCs w:val="28"/>
+        </w:rPr>
+        <w:t>df[</w:t>
+      </w:r>
+      <w:proofErr w:type="gramEnd"/>
+      <w:r>
+        <w:rPr>
+          <w:rStyle w:val="HTMLCode"/>
+          <w:sz w:val="28"/>
+          <w:szCs w:val="28"/>
+        </w:rPr>
+        <w:t>"</w:t>
+      </w:r>
+      <w:proofErr w:type="spellStart"/>
+      <w:r>
+        <w:rPr>
+          <w:rStyle w:val="HTMLCode"/>
+          <w:sz w:val="28"/>
+          <w:szCs w:val="28"/>
+        </w:rPr>
+        <w:t>EstablishmentStatus</w:t>
+      </w:r>
+      <w:proofErr w:type="spellEnd"/>
+      <w:r>
+        <w:rPr>
+          <w:rStyle w:val="HTMLCode"/>
+          <w:sz w:val="28"/>
+          <w:szCs w:val="28"/>
+        </w:rPr>
+        <w:t xml:space="preserve"> (name)"] == "Open"</w:t>
+      </w:r>
+      <w:r>
+        <w:rPr>
+          <w:sz w:val="28"/>
+          <w:szCs w:val="28"/>
+        </w:rPr>
+        <w:t xml:space="preserve"> gives another True/False column, True where status is "Open". The </w:t>
+      </w:r>
+      <w:r>
+        <w:rPr>
+          <w:rStyle w:val="HTMLCode"/>
+          <w:sz w:val="28"/>
+          <w:szCs w:val="28"/>
+        </w:rPr>
+        <w:t>&amp;</w:t>
+      </w:r>
+      <w:r>
+        <w:rPr>
+          <w:sz w:val="28"/>
+          <w:szCs w:val="28"/>
+        </w:rPr>
+        <w:t xml:space="preserve"> combines them row by row: True only where </w:t>
+      </w:r>
+      <w:r>
+        <w:rPr>
+          <w:rStyle w:val="Emphasis"/>
+          <w:sz w:val="28"/>
+          <w:szCs w:val="28"/>
+        </w:rPr>
+        <w:t>both</w:t>
+      </w:r>
+      <w:r>
+        <w:rPr>
+          <w:sz w:val="28"/>
+          <w:szCs w:val="28"/>
+        </w:rPr>
+        <w:t xml:space="preserve"> are True. Then </w:t>
+      </w:r>
+      <w:proofErr w:type="gramStart"/>
+      <w:r>
+        <w:rPr>
+          <w:rStyle w:val="HTMLCode"/>
+          <w:sz w:val="28"/>
+          <w:szCs w:val="28"/>
+        </w:rPr>
+        <w:t>df[</w:t>
+      </w:r>
+      <w:proofErr w:type="gramEnd"/>
+      <w:r>
+        <w:rPr>
+          <w:rStyle w:val="HTMLCode"/>
+          <w:sz w:val="28"/>
+          <w:szCs w:val="28"/>
+        </w:rPr>
+        <w:t xml:space="preserve"> ... ]</w:t>
+      </w:r>
+      <w:r>
+        <w:rPr>
+          <w:sz w:val="28"/>
+          <w:szCs w:val="28"/>
+        </w:rPr>
+        <w:t xml:space="preserve"> — indexing the </w:t>
+      </w:r>
+      <w:proofErr w:type="spellStart"/>
+      <w:r>
+        <w:rPr>
+          <w:sz w:val="28"/>
+          <w:szCs w:val="28"/>
+        </w:rPr>
+        <w:t>DataFrame</w:t>
+      </w:r>
+      <w:proofErr w:type="spellEnd"/>
+      <w:r>
+        <w:rPr>
+          <w:sz w:val="28"/>
+          <w:szCs w:val="28"/>
+        </w:rPr>
+        <w:t xml:space="preserve"> with a True/False column — keeps only the rows marked True. That True/False column is called a </w:t>
+      </w:r>
+      <w:r>
+        <w:rPr>
+          <w:rStyle w:val="Strong"/>
+          <w:sz w:val="28"/>
+          <w:szCs w:val="28"/>
+        </w:rPr>
+        <w:t>mask</w:t>
+      </w:r>
+      <w:r>
+        <w:rPr>
+          <w:sz w:val="28"/>
+          <w:szCs w:val="28"/>
+        </w:rPr>
+        <w:t xml:space="preserve">, and this pattern (build a mask, index with it) is </w:t>
+      </w:r>
+      <w:r>
+        <w:rPr>
+          <w:rStyle w:val="Emphasis"/>
+          <w:sz w:val="28"/>
+          <w:szCs w:val="28"/>
+        </w:rPr>
+        <w:t>the</w:t>
+      </w:r>
+      <w:r>
+        <w:rPr>
+          <w:sz w:val="28"/>
+          <w:szCs w:val="28"/>
+        </w:rPr>
+        <w:t xml:space="preserve"> way you filter in pandas.</w:t>
+      </w:r>
+    </w:p>
+    <w:p>
+      <w:pPr>
+        <w:pStyle w:val="font-claude-response-body"/>
+        <w:rPr>
+          <w:sz w:val="28"/>
+          <w:szCs w:val="28"/>
+        </w:rPr>
+      </w:pPr>
+      <w:r>
+        <w:rPr>
+          <w:sz w:val="28"/>
+          <w:szCs w:val="28"/>
+        </w:rPr>
+        <w:t xml:space="preserve">Two easy-to-miss details in there. You must use </w:t>
+      </w:r>
+      <w:r>
+        <w:rPr>
+          <w:rStyle w:val="HTMLCode"/>
+          <w:sz w:val="28"/>
+          <w:szCs w:val="28"/>
+        </w:rPr>
+        <w:t>&amp;</w:t>
+      </w:r>
+      <w:r>
+        <w:rPr>
+          <w:sz w:val="28"/>
+          <w:szCs w:val="28"/>
+        </w:rPr>
+        <w:t xml:space="preserve">, not the word </w:t>
+      </w:r>
+      <w:r>
+        <w:rPr>
+          <w:rStyle w:val="HTMLCode"/>
+          <w:sz w:val="28"/>
+          <w:szCs w:val="28"/>
+        </w:rPr>
+        <w:t>and</w:t>
+      </w:r>
+      <w:r>
+        <w:rPr>
+          <w:sz w:val="28"/>
+          <w:szCs w:val="28"/>
+        </w:rPr>
+        <w:t xml:space="preserve"> — </w:t>
+      </w:r>
+      <w:r>
+        <w:rPr>
+          <w:rStyle w:val="HTMLCode"/>
+          <w:sz w:val="28"/>
+          <w:szCs w:val="28"/>
+        </w:rPr>
+        <w:t>and</w:t>
+      </w:r>
+      <w:r>
+        <w:rPr>
+          <w:sz w:val="28"/>
+          <w:szCs w:val="28"/>
+        </w:rPr>
+        <w:t xml:space="preserve"> works on single values, </w:t>
+      </w:r>
+      <w:r>
+        <w:rPr>
+          <w:rStyle w:val="HTMLCode"/>
+          <w:sz w:val="28"/>
+          <w:szCs w:val="28"/>
+        </w:rPr>
+        <w:t>&amp;</w:t>
+      </w:r>
+      <w:r>
+        <w:rPr>
+          <w:sz w:val="28"/>
+          <w:szCs w:val="28"/>
+        </w:rPr>
+        <w:t xml:space="preserve"> works </w:t>
+      </w:r>
+      <w:proofErr w:type="gramStart"/>
+      <w:r>
+        <w:rPr>
+          <w:sz w:val="28"/>
+          <w:szCs w:val="28"/>
+        </w:rPr>
+        <w:t>element-wise</w:t>
+      </w:r>
+      <w:proofErr w:type="gramEnd"/>
+      <w:r>
+        <w:rPr>
+          <w:sz w:val="28"/>
+          <w:szCs w:val="28"/>
+        </w:rPr>
+        <w:t xml:space="preserve"> across the whole column, which is what we need. And each condition is wrapped in its own parentheses because </w:t>
+      </w:r>
+      <w:r>
+        <w:rPr>
+          <w:rStyle w:val="HTMLCode"/>
+          <w:sz w:val="28"/>
+          <w:szCs w:val="28"/>
+        </w:rPr>
+        <w:t>&amp;</w:t>
+      </w:r>
+      <w:r>
+        <w:rPr>
+          <w:sz w:val="28"/>
+          <w:szCs w:val="28"/>
+        </w:rPr>
+        <w:t xml:space="preserve"> binds more tightly than </w:t>
+      </w:r>
+      <w:r>
+        <w:rPr>
+          <w:rStyle w:val="HTMLCode"/>
+          <w:sz w:val="28"/>
+          <w:szCs w:val="28"/>
+        </w:rPr>
+        <w:t>==</w:t>
+      </w:r>
+      <w:r>
+        <w:rPr>
+          <w:sz w:val="28"/>
+          <w:szCs w:val="28"/>
+        </w:rPr>
+        <w:t xml:space="preserve">; without the parentheses Python parses it wrongly and errors. The </w:t>
+      </w:r>
+      <w:proofErr w:type="gramStart"/>
+      <w:r>
+        <w:rPr>
+          <w:sz w:val="28"/>
+          <w:szCs w:val="28"/>
+        </w:rPr>
+        <w:t xml:space="preserve">trailing </w:t>
+      </w:r>
+      <w:r>
+        <w:rPr>
+          <w:rStyle w:val="HTMLCode"/>
+          <w:sz w:val="28"/>
+          <w:szCs w:val="28"/>
+        </w:rPr>
+        <w:t>.copy</w:t>
+      </w:r>
+      <w:proofErr w:type="gramEnd"/>
+      <w:r>
+        <w:rPr>
+          <w:rStyle w:val="HTMLCode"/>
+          <w:sz w:val="28"/>
+          <w:szCs w:val="28"/>
+        </w:rPr>
+        <w:t>()</w:t>
+      </w:r>
+      <w:r>
+        <w:rPr>
+          <w:sz w:val="28"/>
+          <w:szCs w:val="28"/>
+        </w:rPr>
+        <w:t xml:space="preserve"> makes </w:t>
+      </w:r>
+      <w:proofErr w:type="spellStart"/>
+      <w:r>
+        <w:rPr>
+          <w:rStyle w:val="HTMLCode"/>
+          <w:sz w:val="28"/>
+          <w:szCs w:val="28"/>
+        </w:rPr>
         <w:t>sl</w:t>
       </w:r>
       <w:proofErr w:type="spellEnd"/>
@@ -973,442 +3184,6 @@
           <w:sz w:val="28"/>
           <w:szCs w:val="28"/>
         </w:rPr>
-        <w:t xml:space="preserve"> = df[</w:t>
-      </w:r>
-    </w:p>
-    <w:p>
-      <w:pPr>
-        <w:pStyle w:val="font-claude-response-body"/>
-        <w:rPr>
-          <w:sz w:val="28"/>
-          <w:szCs w:val="28"/>
-        </w:rPr>
-      </w:pPr>
-      <w:r>
-        <w:rPr>
-          <w:sz w:val="28"/>
-          <w:szCs w:val="28"/>
-        </w:rPr>
-        <w:t xml:space="preserve">    df["LA (name)"].</w:t>
-      </w:r>
-      <w:proofErr w:type="spellStart"/>
-      <w:r>
-        <w:rPr>
-          <w:sz w:val="28"/>
-          <w:szCs w:val="28"/>
-        </w:rPr>
-        <w:t>isin</w:t>
-      </w:r>
-      <w:proofErr w:type="spellEnd"/>
-      <w:r>
-        <w:rPr>
-          <w:sz w:val="28"/>
-          <w:szCs w:val="28"/>
-        </w:rPr>
-        <w:t>(boroughs)</w:t>
-      </w:r>
-    </w:p>
-    <w:p>
-      <w:pPr>
-        <w:pStyle w:val="font-claude-response-body"/>
-        <w:rPr>
-          <w:sz w:val="28"/>
-          <w:szCs w:val="28"/>
-        </w:rPr>
-      </w:pPr>
-      <w:r>
-        <w:rPr>
-          <w:sz w:val="28"/>
-          <w:szCs w:val="28"/>
-        </w:rPr>
-        <w:t xml:space="preserve">    &amp; (df["</w:t>
-      </w:r>
-      <w:proofErr w:type="spellStart"/>
-      <w:r>
-        <w:rPr>
-          <w:sz w:val="28"/>
-          <w:szCs w:val="28"/>
-        </w:rPr>
-        <w:t>EstablishmentStatus</w:t>
-      </w:r>
-      <w:proofErr w:type="spellEnd"/>
-      <w:r>
-        <w:rPr>
-          <w:sz w:val="28"/>
-          <w:szCs w:val="28"/>
-        </w:rPr>
-        <w:t xml:space="preserve"> (name)"] == "Open")</w:t>
-      </w:r>
-    </w:p>
-    <w:p>
-      <w:pPr>
-        <w:pStyle w:val="font-claude-response-body"/>
-        <w:rPr>
-          <w:sz w:val="28"/>
-          <w:szCs w:val="28"/>
-        </w:rPr>
-      </w:pPr>
-      <w:r>
-        <w:rPr>
-          <w:sz w:val="28"/>
-          <w:szCs w:val="28"/>
-        </w:rPr>
-        <w:t>].copy()</w:t>
-      </w:r>
-    </w:p>
-    <w:p>
-      <w:pPr>
-        <w:pStyle w:val="font-claude-response-body"/>
-        <w:rPr>
-          <w:sz w:val="28"/>
-          <w:szCs w:val="28"/>
-        </w:rPr>
-      </w:pPr>
-      <w:r>
-        <w:rPr>
-          <w:sz w:val="28"/>
-          <w:szCs w:val="28"/>
-        </w:rPr>
-        <w:t xml:space="preserve">Read it inside-out. </w:t>
-      </w:r>
-      <w:r>
-        <w:rPr>
-          <w:rStyle w:val="HTMLCode"/>
-          <w:sz w:val="28"/>
-          <w:szCs w:val="28"/>
-        </w:rPr>
-        <w:t>df["LA (name)"]</w:t>
-      </w:r>
-      <w:r>
-        <w:rPr>
-          <w:sz w:val="28"/>
-          <w:szCs w:val="28"/>
-        </w:rPr>
-        <w:t xml:space="preserve"> pulls out a single column (pandas calls a single column a </w:t>
-      </w:r>
-      <w:r>
-        <w:rPr>
-          <w:rStyle w:val="Strong"/>
-          <w:sz w:val="28"/>
-          <w:szCs w:val="28"/>
-        </w:rPr>
-        <w:t>Series</w:t>
-      </w:r>
-      <w:r>
-        <w:rPr>
-          <w:sz w:val="28"/>
-          <w:szCs w:val="28"/>
-        </w:rPr>
-        <w:t xml:space="preserve">). </w:t>
-      </w:r>
-      <w:r>
-        <w:rPr>
-          <w:rStyle w:val="HTMLCode"/>
-          <w:sz w:val="28"/>
-          <w:szCs w:val="28"/>
-        </w:rPr>
-        <w:t>.</w:t>
-      </w:r>
-      <w:proofErr w:type="spellStart"/>
-      <w:r>
-        <w:rPr>
-          <w:rStyle w:val="HTMLCode"/>
-          <w:sz w:val="28"/>
-          <w:szCs w:val="28"/>
-        </w:rPr>
-        <w:t>isin</w:t>
-      </w:r>
-      <w:proofErr w:type="spellEnd"/>
-      <w:r>
-        <w:rPr>
-          <w:rStyle w:val="HTMLCode"/>
-          <w:sz w:val="28"/>
-          <w:szCs w:val="28"/>
-        </w:rPr>
-        <w:t>(boroughs)</w:t>
-      </w:r>
-      <w:r>
-        <w:rPr>
-          <w:sz w:val="28"/>
-          <w:szCs w:val="28"/>
-        </w:rPr>
-        <w:t xml:space="preserve"> turns that column into a column of </w:t>
-      </w:r>
-      <w:r>
-        <w:rPr>
-          <w:rStyle w:val="Strong"/>
-          <w:sz w:val="28"/>
-          <w:szCs w:val="28"/>
-        </w:rPr>
-        <w:t>True/False</w:t>
-      </w:r>
-      <w:r>
-        <w:rPr>
-          <w:sz w:val="28"/>
-          <w:szCs w:val="28"/>
-        </w:rPr>
-        <w:t xml:space="preserve"> — True on rows whose LA name is in our list. Separately, </w:t>
-      </w:r>
-      <w:r>
-        <w:rPr>
-          <w:rStyle w:val="HTMLCode"/>
-          <w:sz w:val="28"/>
-          <w:szCs w:val="28"/>
-        </w:rPr>
-        <w:t>df["</w:t>
-      </w:r>
-      <w:proofErr w:type="spellStart"/>
-      <w:r>
-        <w:rPr>
-          <w:rStyle w:val="HTMLCode"/>
-          <w:sz w:val="28"/>
-          <w:szCs w:val="28"/>
-        </w:rPr>
-        <w:t>EstablishmentStatus</w:t>
-      </w:r>
-      <w:proofErr w:type="spellEnd"/>
-      <w:r>
-        <w:rPr>
-          <w:rStyle w:val="HTMLCode"/>
-          <w:sz w:val="28"/>
-          <w:szCs w:val="28"/>
-        </w:rPr>
-        <w:t xml:space="preserve"> (name)"] == "Open"</w:t>
-      </w:r>
-      <w:r>
-        <w:rPr>
-          <w:sz w:val="28"/>
-          <w:szCs w:val="28"/>
-        </w:rPr>
-        <w:t xml:space="preserve"> gives another True/False column, True where status is "Open". The </w:t>
-      </w:r>
-      <w:r>
-        <w:rPr>
-          <w:rStyle w:val="HTMLCode"/>
-          <w:sz w:val="28"/>
-          <w:szCs w:val="28"/>
-        </w:rPr>
-        <w:t>&amp;</w:t>
-      </w:r>
-      <w:r>
-        <w:rPr>
-          <w:sz w:val="28"/>
-          <w:szCs w:val="28"/>
-        </w:rPr>
-        <w:t xml:space="preserve"> combines them row by row: True only where </w:t>
-      </w:r>
-      <w:r>
-        <w:rPr>
-          <w:rStyle w:val="Emphasis"/>
-          <w:sz w:val="28"/>
-          <w:szCs w:val="28"/>
-        </w:rPr>
-        <w:t>both</w:t>
-      </w:r>
-      <w:r>
-        <w:rPr>
-          <w:sz w:val="28"/>
-          <w:szCs w:val="28"/>
-        </w:rPr>
-        <w:t xml:space="preserve"> are True. Then </w:t>
-      </w:r>
-      <w:r>
-        <w:rPr>
-          <w:rStyle w:val="HTMLCode"/>
-          <w:sz w:val="28"/>
-          <w:szCs w:val="28"/>
-        </w:rPr>
-        <w:t>df[ ... ]</w:t>
-      </w:r>
-      <w:r>
-        <w:rPr>
-          <w:sz w:val="28"/>
-          <w:szCs w:val="28"/>
-        </w:rPr>
-        <w:t xml:space="preserve"> — indexing the </w:t>
-      </w:r>
-      <w:proofErr w:type="spellStart"/>
-      <w:r>
-        <w:rPr>
-          <w:sz w:val="28"/>
-          <w:szCs w:val="28"/>
-        </w:rPr>
-        <w:t>DataFrame</w:t>
-      </w:r>
-      <w:proofErr w:type="spellEnd"/>
-      <w:r>
-        <w:rPr>
-          <w:sz w:val="28"/>
-          <w:szCs w:val="28"/>
-        </w:rPr>
-        <w:t xml:space="preserve"> with a True/False column — keeps only the rows marked True. That True/False column is called a </w:t>
-      </w:r>
-      <w:r>
-        <w:rPr>
-          <w:rStyle w:val="Strong"/>
-          <w:sz w:val="28"/>
-          <w:szCs w:val="28"/>
-        </w:rPr>
-        <w:t>mask</w:t>
-      </w:r>
-      <w:r>
-        <w:rPr>
-          <w:sz w:val="28"/>
-          <w:szCs w:val="28"/>
-        </w:rPr>
-        <w:t xml:space="preserve">, and this pattern (build a mask, index with it) is </w:t>
-      </w:r>
-      <w:r>
-        <w:rPr>
-          <w:rStyle w:val="Emphasis"/>
-          <w:sz w:val="28"/>
-          <w:szCs w:val="28"/>
-        </w:rPr>
-        <w:t>the</w:t>
-      </w:r>
-      <w:r>
-        <w:rPr>
-          <w:sz w:val="28"/>
-          <w:szCs w:val="28"/>
-        </w:rPr>
-        <w:t xml:space="preserve"> way you filter in pandas.</w:t>
-      </w:r>
-    </w:p>
-    <w:p>
-      <w:pPr>
-        <w:pStyle w:val="font-claude-response-body"/>
-        <w:rPr>
-          <w:sz w:val="28"/>
-          <w:szCs w:val="28"/>
-        </w:rPr>
-      </w:pPr>
-      <w:r>
-        <w:rPr>
-          <w:sz w:val="28"/>
-          <w:szCs w:val="28"/>
-        </w:rPr>
-        <w:t xml:space="preserve">Two easy-to-miss details in there. You must use </w:t>
-      </w:r>
-      <w:r>
-        <w:rPr>
-          <w:rStyle w:val="HTMLCode"/>
-          <w:sz w:val="28"/>
-          <w:szCs w:val="28"/>
-        </w:rPr>
-        <w:t>&amp;</w:t>
-      </w:r>
-      <w:r>
-        <w:rPr>
-          <w:sz w:val="28"/>
-          <w:szCs w:val="28"/>
-        </w:rPr>
-        <w:t xml:space="preserve">, not the word </w:t>
-      </w:r>
-      <w:r>
-        <w:rPr>
-          <w:rStyle w:val="HTMLCode"/>
-          <w:sz w:val="28"/>
-          <w:szCs w:val="28"/>
-        </w:rPr>
-        <w:t>and</w:t>
-      </w:r>
-      <w:r>
-        <w:rPr>
-          <w:sz w:val="28"/>
-          <w:szCs w:val="28"/>
-        </w:rPr>
-        <w:t xml:space="preserve"> — </w:t>
-      </w:r>
-      <w:r>
-        <w:rPr>
-          <w:rStyle w:val="HTMLCode"/>
-          <w:sz w:val="28"/>
-          <w:szCs w:val="28"/>
-        </w:rPr>
-        <w:t>and</w:t>
-      </w:r>
-      <w:r>
-        <w:rPr>
-          <w:sz w:val="28"/>
-          <w:szCs w:val="28"/>
-        </w:rPr>
-        <w:t xml:space="preserve"> works on single values, </w:t>
-      </w:r>
-      <w:r>
-        <w:rPr>
-          <w:rStyle w:val="HTMLCode"/>
-          <w:sz w:val="28"/>
-          <w:szCs w:val="28"/>
-        </w:rPr>
-        <w:t>&amp;</w:t>
-      </w:r>
-      <w:r>
-        <w:rPr>
-          <w:sz w:val="28"/>
-          <w:szCs w:val="28"/>
-        </w:rPr>
-        <w:t xml:space="preserve"> works element-wise across the whole column, which is what we need. And each condition is wrapped in its own parentheses because </w:t>
-      </w:r>
-      <w:r>
-        <w:rPr>
-          <w:rStyle w:val="HTMLCode"/>
-          <w:sz w:val="28"/>
-          <w:szCs w:val="28"/>
-        </w:rPr>
-        <w:t>&amp;</w:t>
-      </w:r>
-      <w:r>
-        <w:rPr>
-          <w:sz w:val="28"/>
-          <w:szCs w:val="28"/>
-        </w:rPr>
-        <w:t xml:space="preserve"> binds more tightly than </w:t>
-      </w:r>
-      <w:r>
-        <w:rPr>
-          <w:rStyle w:val="HTMLCode"/>
-          <w:sz w:val="28"/>
-          <w:szCs w:val="28"/>
-        </w:rPr>
-        <w:t>==</w:t>
-      </w:r>
-      <w:r>
-        <w:rPr>
-          <w:sz w:val="28"/>
-          <w:szCs w:val="28"/>
-        </w:rPr>
-        <w:t xml:space="preserve">; without the parentheses Python parses it wrongly and errors. The trailing </w:t>
-      </w:r>
-      <w:r>
-        <w:rPr>
-          <w:rStyle w:val="HTMLCode"/>
-          <w:sz w:val="28"/>
-          <w:szCs w:val="28"/>
-        </w:rPr>
-        <w:t>.copy()</w:t>
-      </w:r>
-      <w:r>
-        <w:rPr>
-          <w:sz w:val="28"/>
-          <w:szCs w:val="28"/>
-        </w:rPr>
-        <w:t xml:space="preserve"> makes </w:t>
-      </w:r>
-      <w:proofErr w:type="spellStart"/>
-      <w:r>
-        <w:rPr>
-          <w:rStyle w:val="HTMLCode"/>
-          <w:sz w:val="28"/>
-          <w:szCs w:val="28"/>
-        </w:rPr>
-        <w:t>sl</w:t>
-      </w:r>
-      <w:proofErr w:type="spellEnd"/>
-      <w:r>
-        <w:rPr>
-          <w:sz w:val="28"/>
-          <w:szCs w:val="28"/>
-        </w:rPr>
         <w:t xml:space="preserve"> a genuinely independent table rather than a view onto </w:t>
       </w:r>
       <w:r>
@@ -1424,23 +3199,32 @@
           <w:sz w:val="28"/>
           <w:szCs w:val="28"/>
         </w:rPr>
-        <w:t xml:space="preserve"> — so when we add columns next, pandas doesn't complain that </w:t>
-      </w:r>
-      <w:r>
-        <w:rPr>
-          <w:sz w:val="28"/>
-          <w:szCs w:val="28"/>
-        </w:rPr>
-        <w:lastRenderedPageBreak/>
-        <w:t xml:space="preserve">we're editing a slice of something else. Getting into the habit of </w:t>
-      </w:r>
-      <w:r>
-        <w:rPr>
-          <w:rStyle w:val="HTMLCode"/>
-          <w:sz w:val="28"/>
-          <w:szCs w:val="28"/>
-        </w:rPr>
-        <w:t>.copy()</w:t>
+        <w:t xml:space="preserve"> — so when we add columns next, pandas doesn't complain that we're editing a slice of something else. Getting into the habit </w:t>
+      </w:r>
+      <w:proofErr w:type="gramStart"/>
+      <w:r>
+        <w:rPr>
+          <w:sz w:val="28"/>
+          <w:szCs w:val="28"/>
+        </w:rPr>
+        <w:t xml:space="preserve">of </w:t>
+      </w:r>
+      <w:r>
+        <w:rPr>
+          <w:rStyle w:val="HTMLCode"/>
+          <w:sz w:val="28"/>
+          <w:szCs w:val="28"/>
+        </w:rPr>
+        <w:t>.copy</w:t>
+      </w:r>
+      <w:proofErr w:type="gramEnd"/>
+      <w:r>
+        <w:rPr>
+          <w:rStyle w:val="HTMLCode"/>
+          <w:sz w:val="28"/>
+          <w:szCs w:val="28"/>
+        </w:rPr>
+        <w:t>()</w:t>
       </w:r>
       <w:r>
         <w:rPr>
@@ -1778,6 +3562,7 @@
         <w:t xml:space="preserve">    (</w:t>
       </w:r>
       <w:proofErr w:type="spellStart"/>
+      <w:proofErr w:type="gramStart"/>
       <w:r>
         <w:rPr>
           <w:sz w:val="28"/>
@@ -1791,6 +3576,63 @@
           <w:sz w:val="28"/>
           <w:szCs w:val="28"/>
         </w:rPr>
+        <w:t>[</w:t>
+      </w:r>
+      <w:proofErr w:type="gramEnd"/>
+      <w:r>
+        <w:rPr>
+          <w:sz w:val="28"/>
+          <w:szCs w:val="28"/>
+        </w:rPr>
+        <w:t>"</w:t>
+      </w:r>
+      <w:proofErr w:type="spellStart"/>
+      <w:r>
+        <w:rPr>
+          <w:sz w:val="28"/>
+          <w:szCs w:val="28"/>
+        </w:rPr>
+        <w:t>NurseryProvision</w:t>
+      </w:r>
+      <w:proofErr w:type="spellEnd"/>
+      <w:r>
+        <w:rPr>
+          <w:sz w:val="28"/>
+          <w:szCs w:val="28"/>
+        </w:rPr>
+        <w:t xml:space="preserve"> (name)"] == "Has Nursery Classes")</w:t>
+      </w:r>
+    </w:p>
+    <w:p>
+      <w:pPr>
+        <w:pStyle w:val="font-claude-response-body"/>
+        <w:rPr>
+          <w:sz w:val="28"/>
+          <w:szCs w:val="28"/>
+        </w:rPr>
+      </w:pPr>
+      <w:r>
+        <w:rPr>
+          <w:sz w:val="28"/>
+          <w:szCs w:val="28"/>
+        </w:rPr>
+        <w:lastRenderedPageBreak/>
+        <w:t xml:space="preserve">    | (</w:t>
+      </w:r>
+      <w:proofErr w:type="spellStart"/>
+      <w:r>
+        <w:rPr>
+          <w:sz w:val="28"/>
+          <w:szCs w:val="28"/>
+        </w:rPr>
+        <w:t>sl</w:t>
+      </w:r>
+      <w:proofErr w:type="spellEnd"/>
+      <w:r>
+        <w:rPr>
+          <w:sz w:val="28"/>
+          <w:szCs w:val="28"/>
+        </w:rPr>
         <w:t>["</w:t>
       </w:r>
       <w:proofErr w:type="spellStart"/>
@@ -1799,15 +3641,15 @@
           <w:sz w:val="28"/>
           <w:szCs w:val="28"/>
         </w:rPr>
-        <w:t>NurseryProvision</w:t>
-      </w:r>
-      <w:proofErr w:type="spellEnd"/>
-      <w:r>
-        <w:rPr>
-          <w:sz w:val="28"/>
-          <w:szCs w:val="28"/>
-        </w:rPr>
-        <w:t xml:space="preserve"> (name)"] == "Has Nursery Classes")</w:t>
+        <w:t>StatutoryLowAge</w:t>
+      </w:r>
+      <w:proofErr w:type="spellEnd"/>
+      <w:r>
+        <w:rPr>
+          <w:sz w:val="28"/>
+          <w:szCs w:val="28"/>
+        </w:rPr>
+        <w:t>"] &lt;= 3)</w:t>
       </w:r>
     </w:p>
     <w:p>
@@ -1823,11 +3665,222 @@
           <w:sz w:val="28"/>
           <w:szCs w:val="28"/>
         </w:rPr>
-        <w:t xml:space="preserve">    | (</w:t>
-      </w:r>
-      <w:proofErr w:type="spellStart"/>
-      <w:r>
-        <w:rPr>
+        <w:t>)</w:t>
+      </w:r>
+    </w:p>
+    <w:p>
+      <w:pPr>
+        <w:pStyle w:val="font-claude-response-body"/>
+        <w:rPr>
+          <w:sz w:val="28"/>
+          <w:szCs w:val="28"/>
+        </w:rPr>
+      </w:pPr>
+    </w:p>
+    <w:p>
+      <w:pPr>
+        <w:pStyle w:val="font-claude-response-body"/>
+        <w:rPr>
+          <w:sz w:val="28"/>
+          <w:szCs w:val="28"/>
+        </w:rPr>
+      </w:pPr>
+      <w:r>
+        <w:rPr>
+          <w:sz w:val="28"/>
+          <w:szCs w:val="28"/>
+        </w:rPr>
+        <w:t xml:space="preserve">Same mask idea, but instead of filtering we're </w:t>
+      </w:r>
+      <w:r>
+        <w:rPr>
+          <w:rStyle w:val="Emphasis"/>
+          <w:sz w:val="28"/>
+          <w:szCs w:val="28"/>
+        </w:rPr>
+        <w:t>storing</w:t>
+      </w:r>
+      <w:r>
+        <w:rPr>
+          <w:sz w:val="28"/>
+          <w:szCs w:val="28"/>
+        </w:rPr>
+        <w:t xml:space="preserve"> the mask as a new column called </w:t>
+      </w:r>
+      <w:proofErr w:type="spellStart"/>
+      <w:r>
+        <w:rPr>
+          <w:rStyle w:val="HTMLCode"/>
+          <w:sz w:val="28"/>
+          <w:szCs w:val="28"/>
+        </w:rPr>
+        <w:t>is_early_years</w:t>
+      </w:r>
+      <w:proofErr w:type="spellEnd"/>
+      <w:r>
+        <w:rPr>
+          <w:sz w:val="28"/>
+          <w:szCs w:val="28"/>
+        </w:rPr>
+        <w:t xml:space="preserve">. The first condition is True where the school has nursery classes; the second is True where it takes children aged 3 or under; </w:t>
+      </w:r>
+      <w:r>
+        <w:rPr>
+          <w:rStyle w:val="HTMLCode"/>
+          <w:sz w:val="28"/>
+          <w:szCs w:val="28"/>
+        </w:rPr>
+        <w:t>|</w:t>
+      </w:r>
+      <w:r>
+        <w:rPr>
+          <w:sz w:val="28"/>
+          <w:szCs w:val="28"/>
+        </w:rPr>
+        <w:t xml:space="preserve"> is </w:t>
+      </w:r>
+      <w:proofErr w:type="gramStart"/>
+      <w:r>
+        <w:rPr>
+          <w:sz w:val="28"/>
+          <w:szCs w:val="28"/>
+        </w:rPr>
+        <w:t>element-wise</w:t>
+      </w:r>
+      <w:proofErr w:type="gramEnd"/>
+      <w:r>
+        <w:rPr>
+          <w:sz w:val="28"/>
+          <w:szCs w:val="28"/>
+        </w:rPr>
+        <w:t xml:space="preserve"> </w:t>
+      </w:r>
+      <w:r>
+        <w:rPr>
+          <w:rStyle w:val="Strong"/>
+          <w:sz w:val="28"/>
+          <w:szCs w:val="28"/>
+        </w:rPr>
+        <w:t>OR</w:t>
+      </w:r>
+      <w:r>
+        <w:rPr>
+          <w:sz w:val="28"/>
+          <w:szCs w:val="28"/>
+        </w:rPr>
+        <w:t xml:space="preserve">, so the row is True if </w:t>
+      </w:r>
+      <w:r>
+        <w:rPr>
+          <w:rStyle w:val="Emphasis"/>
+          <w:sz w:val="28"/>
+          <w:szCs w:val="28"/>
+        </w:rPr>
+        <w:t>either</w:t>
+      </w:r>
+      <w:r>
+        <w:rPr>
+          <w:sz w:val="28"/>
+          <w:szCs w:val="28"/>
+        </w:rPr>
+        <w:t xml:space="preserve"> holds. (</w:t>
+      </w:r>
+      <w:r>
+        <w:rPr>
+          <w:rStyle w:val="HTMLCode"/>
+          <w:sz w:val="28"/>
+          <w:szCs w:val="28"/>
+        </w:rPr>
+        <w:t>|</w:t>
+      </w:r>
+      <w:r>
+        <w:rPr>
+          <w:sz w:val="28"/>
+          <w:szCs w:val="28"/>
+        </w:rPr>
+        <w:t xml:space="preserve"> and parentheses for the same reasons </w:t>
+      </w:r>
+      <w:r>
+        <w:rPr>
+          <w:rStyle w:val="HTMLCode"/>
+          <w:sz w:val="28"/>
+          <w:szCs w:val="28"/>
+        </w:rPr>
+        <w:t>&amp;</w:t>
+      </w:r>
+      <w:r>
+        <w:rPr>
+          <w:sz w:val="28"/>
+          <w:szCs w:val="28"/>
+        </w:rPr>
+        <w:t xml:space="preserve"> needed them.) One quietly sensible thing: a row with a missing age — </w:t>
+      </w:r>
+      <w:proofErr w:type="spellStart"/>
+      <w:r>
+        <w:rPr>
+          <w:sz w:val="28"/>
+          <w:szCs w:val="28"/>
+        </w:rPr>
+        <w:t>NaN</w:t>
+      </w:r>
+      <w:proofErr w:type="spellEnd"/>
+      <w:r>
+        <w:rPr>
+          <w:sz w:val="28"/>
+          <w:szCs w:val="28"/>
+        </w:rPr>
+        <w:t xml:space="preserve"> — evaluates </w:t>
+      </w:r>
+      <w:proofErr w:type="spellStart"/>
+      <w:r>
+        <w:rPr>
+          <w:rStyle w:val="HTMLCode"/>
+          <w:sz w:val="28"/>
+          <w:szCs w:val="28"/>
+        </w:rPr>
+        <w:t>NaN</w:t>
+      </w:r>
+      <w:proofErr w:type="spellEnd"/>
+      <w:r>
+        <w:rPr>
+          <w:rStyle w:val="HTMLCode"/>
+          <w:sz w:val="28"/>
+          <w:szCs w:val="28"/>
+        </w:rPr>
+        <w:t xml:space="preserve"> &lt;= 3</w:t>
+      </w:r>
+      <w:r>
+        <w:rPr>
+          <w:sz w:val="28"/>
+          <w:szCs w:val="28"/>
+        </w:rPr>
+        <w:t xml:space="preserve"> as False, so schools with no age recorded simply aren't flagged by that half, which is the behaviour you want. After this line, all 223 rows carry a True or False in the new column.</w:t>
+      </w:r>
+    </w:p>
+    <w:p>
+      <w:pPr>
+        <w:pStyle w:val="font-claude-response-body"/>
+        <w:rPr>
+          <w:sz w:val="28"/>
+          <w:szCs w:val="28"/>
+        </w:rPr>
+      </w:pPr>
+      <w:r>
+        <w:rPr>
+          <w:rStyle w:val="HTMLCode"/>
+          <w:b/>
+          <w:bCs/>
+          <w:sz w:val="28"/>
+          <w:szCs w:val="28"/>
+        </w:rPr>
+        <w:t xml:space="preserve">early = </w:t>
+      </w:r>
+      <w:proofErr w:type="spellStart"/>
+      <w:r>
+        <w:rPr>
+          <w:rStyle w:val="HTMLCode"/>
+          <w:b/>
+          <w:bCs/>
           <w:sz w:val="28"/>
           <w:szCs w:val="28"/>
         </w:rPr>
@@ -1836,6 +3889,31 @@
       <w:proofErr w:type="spellEnd"/>
       <w:r>
         <w:rPr>
+          <w:rStyle w:val="HTMLCode"/>
+          <w:b/>
+          <w:bCs/>
+          <w:sz w:val="28"/>
+          <w:szCs w:val="28"/>
+        </w:rPr>
+        <w:t>[</w:t>
+      </w:r>
+      <w:proofErr w:type="spellStart"/>
+      <w:r>
+        <w:rPr>
+          <w:rStyle w:val="HTMLCode"/>
+          <w:b/>
+          <w:bCs/>
+          <w:sz w:val="28"/>
+          <w:szCs w:val="28"/>
+        </w:rPr>
+        <w:t>sl</w:t>
+      </w:r>
+      <w:proofErr w:type="spellEnd"/>
+      <w:r>
+        <w:rPr>
+          <w:rStyle w:val="HTMLCode"/>
+          <w:b/>
+          <w:bCs/>
           <w:sz w:val="28"/>
           <w:szCs w:val="28"/>
         </w:rPr>
@@ -1844,79 +3922,9 @@
       <w:proofErr w:type="spellStart"/>
       <w:r>
         <w:rPr>
-          <w:sz w:val="28"/>
-          <w:szCs w:val="28"/>
-        </w:rPr>
-        <w:t>StatutoryLowAge</w:t>
-      </w:r>
-      <w:proofErr w:type="spellEnd"/>
-      <w:r>
-        <w:rPr>
-          <w:sz w:val="28"/>
-          <w:szCs w:val="28"/>
-        </w:rPr>
-        <w:t>"] &lt;= 3)</w:t>
-      </w:r>
-    </w:p>
-    <w:p>
-      <w:pPr>
-        <w:pStyle w:val="font-claude-response-body"/>
-        <w:rPr>
-          <w:sz w:val="28"/>
-          <w:szCs w:val="28"/>
-        </w:rPr>
-      </w:pPr>
-      <w:r>
-        <w:rPr>
-          <w:sz w:val="28"/>
-          <w:szCs w:val="28"/>
-        </w:rPr>
-        <w:t>)</w:t>
-      </w:r>
-    </w:p>
-    <w:p>
-      <w:pPr>
-        <w:pStyle w:val="font-claude-response-body"/>
-        <w:rPr>
-          <w:sz w:val="28"/>
-          <w:szCs w:val="28"/>
-        </w:rPr>
-      </w:pPr>
-    </w:p>
-    <w:p>
-      <w:pPr>
-        <w:pStyle w:val="font-claude-response-body"/>
-        <w:rPr>
-          <w:sz w:val="28"/>
-          <w:szCs w:val="28"/>
-        </w:rPr>
-      </w:pPr>
-      <w:r>
-        <w:rPr>
-          <w:sz w:val="28"/>
-          <w:szCs w:val="28"/>
-        </w:rPr>
-        <w:t xml:space="preserve">Same mask idea, but instead of filtering we're </w:t>
-      </w:r>
-      <w:r>
-        <w:rPr>
-          <w:rStyle w:val="Emphasis"/>
-          <w:sz w:val="28"/>
-          <w:szCs w:val="28"/>
-        </w:rPr>
-        <w:t>storing</w:t>
-      </w:r>
-      <w:r>
-        <w:rPr>
-          <w:sz w:val="28"/>
-          <w:szCs w:val="28"/>
-        </w:rPr>
-        <w:t xml:space="preserve"> the mask as a new column called </w:t>
-      </w:r>
-      <w:proofErr w:type="spellStart"/>
-      <w:r>
-        <w:rPr>
-          <w:rStyle w:val="HTMLCode"/>
+          <w:rStyle w:val="HTMLCode"/>
+          <w:b/>
+          <w:bCs/>
           <w:sz w:val="28"/>
           <w:szCs w:val="28"/>
         </w:rPr>
@@ -1925,211 +3933,35 @@
       <w:proofErr w:type="spellEnd"/>
       <w:r>
         <w:rPr>
-          <w:sz w:val="28"/>
-          <w:szCs w:val="28"/>
-        </w:rPr>
-        <w:t xml:space="preserve">. The first condition is True where the school has nursery classes; the second is True where it takes children aged 3 or under; </w:t>
-      </w:r>
-      <w:r>
-        <w:rPr>
-          <w:rStyle w:val="HTMLCode"/>
-          <w:sz w:val="28"/>
-          <w:szCs w:val="28"/>
-        </w:rPr>
-        <w:t>|</w:t>
-      </w:r>
-      <w:r>
-        <w:rPr>
-          <w:sz w:val="28"/>
-          <w:szCs w:val="28"/>
-        </w:rPr>
-        <w:t xml:space="preserve"> is element-wise </w:t>
-      </w:r>
-      <w:r>
-        <w:rPr>
-          <w:rStyle w:val="Strong"/>
-          <w:sz w:val="28"/>
-          <w:szCs w:val="28"/>
-        </w:rPr>
-        <w:t>OR</w:t>
-      </w:r>
-      <w:r>
-        <w:rPr>
-          <w:sz w:val="28"/>
-          <w:szCs w:val="28"/>
-        </w:rPr>
-        <w:t xml:space="preserve">, so the row is True if </w:t>
-      </w:r>
-      <w:r>
-        <w:rPr>
-          <w:rStyle w:val="Emphasis"/>
-          <w:sz w:val="28"/>
-          <w:szCs w:val="28"/>
-        </w:rPr>
-        <w:t>either</w:t>
-      </w:r>
-      <w:r>
-        <w:rPr>
-          <w:sz w:val="28"/>
-          <w:szCs w:val="28"/>
-        </w:rPr>
-        <w:t xml:space="preserve"> holds. (</w:t>
-      </w:r>
-      <w:r>
-        <w:rPr>
-          <w:rStyle w:val="HTMLCode"/>
-          <w:sz w:val="28"/>
-          <w:szCs w:val="28"/>
-        </w:rPr>
-        <w:t>|</w:t>
-      </w:r>
-      <w:r>
-        <w:rPr>
-          <w:sz w:val="28"/>
-          <w:szCs w:val="28"/>
-        </w:rPr>
-        <w:t xml:space="preserve"> and parentheses for the same reasons </w:t>
-      </w:r>
-      <w:r>
-        <w:rPr>
-          <w:rStyle w:val="HTMLCode"/>
-          <w:sz w:val="28"/>
-          <w:szCs w:val="28"/>
-        </w:rPr>
-        <w:t>&amp;</w:t>
-      </w:r>
-      <w:r>
-        <w:rPr>
-          <w:sz w:val="28"/>
-          <w:szCs w:val="28"/>
-        </w:rPr>
-        <w:t xml:space="preserve"> needed them.) One quietly sensible thing: a row with a missing age — </w:t>
-      </w:r>
-      <w:proofErr w:type="spellStart"/>
-      <w:r>
-        <w:rPr>
-          <w:sz w:val="28"/>
-          <w:szCs w:val="28"/>
-        </w:rPr>
-        <w:t>NaN</w:t>
-      </w:r>
-      <w:proofErr w:type="spellEnd"/>
-      <w:r>
-        <w:rPr>
-          <w:sz w:val="28"/>
-          <w:szCs w:val="28"/>
-        </w:rPr>
-        <w:t xml:space="preserve"> — evaluates </w:t>
-      </w:r>
-      <w:proofErr w:type="spellStart"/>
-      <w:r>
-        <w:rPr>
-          <w:rStyle w:val="HTMLCode"/>
-          <w:sz w:val="28"/>
-          <w:szCs w:val="28"/>
-        </w:rPr>
-        <w:t>NaN</w:t>
-      </w:r>
-      <w:proofErr w:type="spellEnd"/>
-      <w:r>
-        <w:rPr>
-          <w:rStyle w:val="HTMLCode"/>
-          <w:sz w:val="28"/>
-          <w:szCs w:val="28"/>
-        </w:rPr>
-        <w:t xml:space="preserve"> &lt;= 3</w:t>
-      </w:r>
-      <w:r>
-        <w:rPr>
-          <w:sz w:val="28"/>
-          <w:szCs w:val="28"/>
-        </w:rPr>
-        <w:t xml:space="preserve"> as False, so schools with no age recorded simply aren't flagged by that half, which is the behaviour you want. After this line, all 223 rows carry a True or False in the new column.</w:t>
-      </w:r>
-    </w:p>
-    <w:p>
-      <w:pPr>
-        <w:pStyle w:val="font-claude-response-body"/>
-        <w:rPr>
-          <w:sz w:val="28"/>
-          <w:szCs w:val="28"/>
-        </w:rPr>
-      </w:pPr>
-      <w:r>
-        <w:rPr>
-          <w:rStyle w:val="HTMLCode"/>
-          <w:b/>
-          <w:bCs/>
-          <w:sz w:val="28"/>
-          <w:szCs w:val="28"/>
-        </w:rPr>
-        <w:t xml:space="preserve">early = </w:t>
-      </w:r>
-      <w:proofErr w:type="spellStart"/>
-      <w:r>
-        <w:rPr>
-          <w:rStyle w:val="HTMLCode"/>
-          <w:b/>
-          <w:bCs/>
-          <w:sz w:val="28"/>
-          <w:szCs w:val="28"/>
-        </w:rPr>
-        <w:t>sl</w:t>
-      </w:r>
-      <w:proofErr w:type="spellEnd"/>
-      <w:r>
-        <w:rPr>
-          <w:rStyle w:val="HTMLCode"/>
-          <w:b/>
-          <w:bCs/>
-          <w:sz w:val="28"/>
-          <w:szCs w:val="28"/>
-        </w:rPr>
-        <w:t>[</w:t>
-      </w:r>
-      <w:proofErr w:type="spellStart"/>
-      <w:r>
-        <w:rPr>
-          <w:rStyle w:val="HTMLCode"/>
-          <w:b/>
-          <w:bCs/>
-          <w:sz w:val="28"/>
-          <w:szCs w:val="28"/>
-        </w:rPr>
-        <w:t>sl</w:t>
-      </w:r>
-      <w:proofErr w:type="spellEnd"/>
-      <w:r>
-        <w:rPr>
-          <w:rStyle w:val="HTMLCode"/>
-          <w:b/>
-          <w:bCs/>
-          <w:sz w:val="28"/>
-          <w:szCs w:val="28"/>
-        </w:rPr>
-        <w:t>["</w:t>
-      </w:r>
-      <w:proofErr w:type="spellStart"/>
-      <w:r>
-        <w:rPr>
-          <w:rStyle w:val="HTMLCode"/>
-          <w:b/>
-          <w:bCs/>
-          <w:sz w:val="28"/>
-          <w:szCs w:val="28"/>
-        </w:rPr>
-        <w:t>is_early_years</w:t>
-      </w:r>
-      <w:proofErr w:type="spellEnd"/>
-      <w:r>
-        <w:rPr>
-          <w:rStyle w:val="HTMLCode"/>
-          <w:b/>
-          <w:bCs/>
-          <w:sz w:val="28"/>
-          <w:szCs w:val="28"/>
-        </w:rPr>
-        <w:t>"]].copy()</w:t>
+          <w:rStyle w:val="HTMLCode"/>
+          <w:b/>
+          <w:bCs/>
+          <w:sz w:val="28"/>
+          <w:szCs w:val="28"/>
+        </w:rPr>
+        <w:t>"]</w:t>
+      </w:r>
+      <w:proofErr w:type="gramStart"/>
+      <w:r>
+        <w:rPr>
+          <w:rStyle w:val="HTMLCode"/>
+          <w:b/>
+          <w:bCs/>
+          <w:sz w:val="28"/>
+          <w:szCs w:val="28"/>
+        </w:rPr>
+        <w:t>].copy</w:t>
+      </w:r>
+      <w:proofErr w:type="gramEnd"/>
+      <w:r>
+        <w:rPr>
+          <w:rStyle w:val="HTMLCode"/>
+          <w:b/>
+          <w:bCs/>
+          <w:sz w:val="28"/>
+          <w:szCs w:val="28"/>
+        </w:rPr>
+        <w:t>()</w:t>
       </w:r>
       <w:r>
         <w:rPr>
@@ -2172,13 +4004,23 @@
         </w:rPr>
         <w:t xml:space="preserve"> is True. </w:t>
       </w:r>
-      <w:r>
-        <w:rPr>
-          <w:rStyle w:val="HTMLCode"/>
-          <w:sz w:val="28"/>
-          <w:szCs w:val="28"/>
-        </w:rPr>
-        <w:t>.copy()</w:t>
+      <w:proofErr w:type="gramStart"/>
+      <w:r>
+        <w:rPr>
+          <w:rStyle w:val="HTMLCode"/>
+          <w:sz w:val="28"/>
+          <w:szCs w:val="28"/>
+        </w:rPr>
+        <w:t>.copy</w:t>
+      </w:r>
+      <w:proofErr w:type="gramEnd"/>
+      <w:r>
+        <w:rPr>
+          <w:rStyle w:val="HTMLCode"/>
+          <w:sz w:val="28"/>
+          <w:szCs w:val="28"/>
+        </w:rPr>
+        <w:t>()</w:t>
       </w:r>
       <w:r>
         <w:rPr>
@@ -2280,6 +4122,7 @@
         <w:br/>
       </w:r>
       <w:proofErr w:type="spellStart"/>
+      <w:proofErr w:type="gramStart"/>
       <w:r>
         <w:rPr>
           <w:rStyle w:val="HTMLCode"/>
@@ -2295,7 +4138,16 @@
           <w:sz w:val="28"/>
           <w:szCs w:val="28"/>
         </w:rPr>
-        <w:t>()</w:t>
+        <w:t>(</w:t>
+      </w:r>
+      <w:proofErr w:type="gramEnd"/>
+      <w:r>
+        <w:rPr>
+          <w:rStyle w:val="HTMLCode"/>
+          <w:sz w:val="28"/>
+          <w:szCs w:val="28"/>
+        </w:rPr>
+        <w:t>)</w:t>
       </w:r>
       <w:r>
         <w:rPr>
@@ -2351,13 +4203,23 @@
         </w:rPr>
         <w:t xml:space="preserve">The one idea to carry forward: nearly all pandas selection is </w:t>
       </w:r>
+      <w:proofErr w:type="gramStart"/>
       <w:r>
         <w:rPr>
           <w:rStyle w:val="Strong"/>
           <w:sz w:val="28"/>
           <w:szCs w:val="28"/>
         </w:rPr>
-        <w:t>make a column of True/False, then index with it</w:t>
+        <w:t>make</w:t>
+      </w:r>
+      <w:proofErr w:type="gramEnd"/>
+      <w:r>
+        <w:rPr>
+          <w:rStyle w:val="Strong"/>
+          <w:sz w:val="28"/>
+          <w:szCs w:val="28"/>
+        </w:rPr>
+        <w:t xml:space="preserve"> a column of True/False, then index with it</w:t>
       </w:r>
       <w:r>
         <w:rPr>
@@ -2458,6 +4320,15 @@
         </w:rPr>
         <w:t xml:space="preserve"> combine them. Once that clicks, filtering stops feeling like syntax to memorise and starts feeling obvious. Ask me to expand any line further.</w:t>
       </w:r>
+    </w:p>
+    <w:p>
+      <w:pPr>
+        <w:pStyle w:val="font-claude-response-body"/>
+        <w:rPr>
+          <w:sz w:val="28"/>
+          <w:szCs w:val="28"/>
+        </w:rPr>
+      </w:pPr>
     </w:p>
     <w:p>
       <w:pPr>

</xml_diff>